<commit_message>
Journal: log WP0.1 scaffold completion (Entry 43)
Documents two implementation-time refinements found while scaffolding: dropping User.password_hash in favor of Supabase Auth ownership, and adopting Prisma 7's required driver-adapter pattern.
</commit_message>
<xml_diff>
--- a/Projectinformation/Development_Journal.docx
+++ b/Projectinformation/Development_Journal.docx
@@ -8776,6 +8776,144 @@
     <w:p>
       <w:r>
         <w:t>User confirmed. This is the only design consistent with the purpose of the review-approval gate in the first place — an unapproved review appearing publicly, or accumulating votes/seal candidacy, would defeat the requirement entirely.</w:t>
+      </w:r>
+    </w:p>
+    <w:p/>
+    <w:p>
+      <w:pPr>
+        <w:pStyle w:val="Heading1"/>
+        <w:spacing w:before="360"/>
+      </w:pPr>
+      <w:r>
+        <w:t>Entry 43: WP0.1 Implemented — Next.js/Prisma Scaffold, with a Schema Correction and a Prisma 7 Adjustment</w:t>
+      </w:r>
+    </w:p>
+    <w:p>
+      <w:pPr>
+        <w:spacing w:after="80"/>
+      </w:pPr>
+      <w:r>
+        <w:rPr>
+          <w:rStyle w:val="FieldLabel"/>
+        </w:rPr>
+        <w:t xml:space="preserve">Date: </w:t>
+      </w:r>
+      <w:r>
+        <w:t>2026-08-14</w:t>
+      </w:r>
+    </w:p>
+    <w:p>
+      <w:pPr>
+        <w:spacing w:after="80"/>
+      </w:pPr>
+      <w:r>
+        <w:rPr>
+          <w:rStyle w:val="FieldLabel"/>
+        </w:rPr>
+        <w:t xml:space="preserve">Type: </w:t>
+      </w:r>
+      <w:r>
+        <w:t>Decision</w:t>
+      </w:r>
+    </w:p>
+    <w:p>
+      <w:pPr>
+        <w:spacing w:after="80"/>
+      </w:pPr>
+      <w:r>
+        <w:rPr>
+          <w:rStyle w:val="FieldLabel"/>
+        </w:rPr>
+        <w:t xml:space="preserve">Status: </w:t>
+      </w:r>
+      <w:r>
+        <w:rPr>
+          <w:b/>
+          <w:color w:val="2E7D32"/>
+        </w:rPr>
+        <w:t>Resolved</w:t>
+      </w:r>
+    </w:p>
+    <w:p>
+      <w:pPr>
+        <w:spacing w:after="80"/>
+      </w:pPr>
+      <w:r>
+        <w:rPr>
+          <w:rStyle w:val="FieldLabel"/>
+        </w:rPr>
+        <w:t xml:space="preserve">Relates To: </w:t>
+      </w:r>
+      <w:r>
+        <w:t>Implements Work Package WP0.1 from the Requirements Engineering doc, Section 8</w:t>
+      </w:r>
+    </w:p>
+    <w:p>
+      <w:pPr>
+        <w:pStyle w:val="Heading2"/>
+      </w:pPr>
+      <w:r>
+        <w:t>What this step was about</w:t>
+      </w:r>
+    </w:p>
+    <w:p>
+      <w:r>
+        <w:t>Scaffolded the Next.js/TypeScript app and Prisma schema per the chosen stack (Entries 30–39), and made two implementation-time decisions not previously spelled out: dropping the password_hash field from the User model, and adopting Prisma's driver-adapter pattern.</w:t>
+      </w:r>
+    </w:p>
+    <w:p>
+      <w:r>
+        <w:t>WP0.1 covers project scaffolding, the core data model, Supabase project setup, and Vercel's deploy pipeline. This entry covers what was actually completed: Next.js init (TypeScript, App Router, Tailwind, ESLint) at the repo root, Prisma init and a full schema.prisma translating Section 7's data model into models/enums, a seed script for the Category/SealType tables, and env-variable scaffolding (.env.example) for the Supabase variables Section WP0.2 will need. Supabase project creation and Vercel repo import were not completed in this step, since both require an interactive browser login only the user can perform.</w:t>
+      </w:r>
+    </w:p>
+    <w:p>
+      <w:pPr>
+        <w:pStyle w:val="Heading2"/>
+      </w:pPr>
+      <w:r>
+        <w:t>Decision made</w:t>
+      </w:r>
+    </w:p>
+    <w:p>
+      <w:r>
+        <w:t>Two implementation-time refinements to the documented design: (1) The `User` model does not store a password_hash field, unlike the brief's original generic sketch — Supabase Auth (Entry 34) owns credentials and sessions entirely; the Prisma `User.id` is set to match the corresponding `auth.users.id` rather than being independently auto-generated, and the table only holds app-profile fields (username, avatar, bio, role, reputation, etc.). (2) Prisma 7's new 'prisma-client' generator (used per Entry 33) requires an explicit driver adapter rather than an implicit DATABASE_URL connection — `@prisma/adapter-pg` (node-postgres) was added and wired into both the app's Prisma singleton (src/lib/prisma.ts) and the seed script, since this wasn't yet known at the time Entry 33 was decided.</w:t>
+      </w:r>
+    </w:p>
+    <w:p>
+      <w:pPr>
+        <w:pStyle w:val="Heading2"/>
+      </w:pPr>
+      <w:r>
+        <w:t>Why this decision was made</w:t>
+      </w:r>
+    </w:p>
+    <w:p>
+      <w:r>
+        <w:t>Both are corrections forced by details only visible once actually building against the chosen tools, not changes of direction: storing a redundant password_hash would contradict Entry 34's own reasoning (Supabase Auth as the single source of truth for credentials), and the driver-adapter requirement is simply how Prisma 7's client generator works — node-postgres is the standard, well-supported adapter for a plain Postgres connection (as opposed to Neon's or PlanetScale's specialized serverless adapters), so it was the natural choice given Entry 32's Supabase/Postgres decision.</w:t>
+      </w:r>
+    </w:p>
+    <w:p>
+      <w:pPr>
+        <w:pStyle w:val="Heading2"/>
+      </w:pPr>
+      <w:r>
+        <w:t>Open sub-items</w:t>
+      </w:r>
+    </w:p>
+    <w:p>
+      <w:pPr>
+        <w:pStyle w:val="ListBullet"/>
+      </w:pPr>
+      <w:r>
+        <w:t>Supabase project creation (WP0.2) — requires the user to sign up and create a project via the Supabase dashboard; connection details then go into .env per .env.example.</w:t>
+      </w:r>
+    </w:p>
+    <w:p>
+      <w:pPr>
+        <w:pStyle w:val="ListBullet"/>
+      </w:pPr>
+      <w:r>
+        <w:t>Vercel repo import — the user already has a Vercel account; the GitHub repo (sol-arcadedev/CertifiedBangers) still needs to be imported via the Vercel dashboard to stand up the deploy pipeline and Vercel Cron (Entry 36).</w:t>
       </w:r>
     </w:p>
     <w:p/>

</xml_diff>

<commit_message>
Journal: log Entry 57 — mirror execution, Node fix, and ceiling closure
Documents this session's path to actually completing the Entry 56
mirror: two interrupted local background runs, moving the one-time
backfill to GitHub Actions, the Node 20->22 fix for
@supabase/supabase-js, making page-level failures non-fatal, and the
month-level sub-partitioning fix that closed the per-year ~5000-result
ceiling for 2018-2025. Final count: 126,927 mirrored titles.

Co-Authored-By: Claude Sonnet 5 <noreply@anthropic.com>
</commit_message>
<xml_diff>
--- a/Projectinformation/Development_Journal.docx
+++ b/Projectinformation/Development_Journal.docx
@@ -10640,6 +10640,120 @@
     <w:p>
       <w:r>
         <w:t>User's explicit direction, including the two clarifying choices (daily cadence, re-host every cover). GitHub Actions over Vercel Cron: a full-catalog refresh takes on the order of an hour or more even for a lightweight batched pass, which exceeds Vercel's serverless function timeout regardless of plan tier, while GitHub Actions' free tier allows up to 6 hours per scheduled job. The AniList pagination-cap bug was caught by actually running the script against the live API early and watching its real output rather than trusting the API's self-reported pageInfo fields — the same 'verify against reality, don't guess' discipline this project has applied to AniList's schema before (e.g. Entry 52's rate-limit discovery during planning).</w:t>
+      </w:r>
+    </w:p>
+    <w:p/>
+    <w:p>
+      <w:pPr>
+        <w:pStyle w:val="Heading1"/>
+        <w:spacing w:before="360"/>
+      </w:pPr>
+      <w:r>
+        <w:t>Entry 57: Full AniList Catalog Mirror — Execution, Ceiling Fix, and Completion</w:t>
+      </w:r>
+    </w:p>
+    <w:p>
+      <w:pPr>
+        <w:spacing w:after="80"/>
+      </w:pPr>
+      <w:r>
+        <w:rPr>
+          <w:rStyle w:val="FieldLabel"/>
+        </w:rPr>
+        <w:t xml:space="preserve">Date: </w:t>
+      </w:r>
+      <w:r>
+        <w:t>2026-08-24</w:t>
+      </w:r>
+    </w:p>
+    <w:p>
+      <w:pPr>
+        <w:spacing w:after="80"/>
+      </w:pPr>
+      <w:r>
+        <w:rPr>
+          <w:rStyle w:val="FieldLabel"/>
+        </w:rPr>
+        <w:t xml:space="preserve">Type: </w:t>
+      </w:r>
+      <w:r>
+        <w:t>Bug</w:t>
+      </w:r>
+    </w:p>
+    <w:p>
+      <w:pPr>
+        <w:spacing w:after="80"/>
+      </w:pPr>
+      <w:r>
+        <w:rPr>
+          <w:rStyle w:val="FieldLabel"/>
+        </w:rPr>
+        <w:t xml:space="preserve">Status: </w:t>
+      </w:r>
+      <w:r>
+        <w:rPr>
+          <w:b/>
+          <w:color w:val="2E7D32"/>
+        </w:rPr>
+        <w:t>Resolved</w:t>
+      </w:r>
+    </w:p>
+    <w:p>
+      <w:pPr>
+        <w:spacing w:after="80"/>
+      </w:pPr>
+      <w:r>
+        <w:rPr>
+          <w:rStyle w:val="FieldLabel"/>
+        </w:rPr>
+        <w:t xml:space="preserve">Relates To: </w:t>
+      </w:r>
+      <w:r>
+        <w:t>Follow-up to Entry 56 (the full-mirror decision and initial scripts) — this entry covers actually getting the one-time backfill to run to completion.</w:t>
+      </w:r>
+    </w:p>
+    <w:p>
+      <w:pPr>
+        <w:pStyle w:val="Heading2"/>
+      </w:pPr>
+      <w:r>
+        <w:t>What this step was about</w:t>
+      </w:r>
+    </w:p>
+    <w:p>
+      <w:r>
+        <w:t>The one-time full-catalog backfill (scripts/mirror-anilist-catalog.ts) failed twice when run locally in the background (unrelated to the script — the local session/machine was interrupted mid-run), so it was moved to a new workflow_dispatch-only GitHub Actions workflow instead, which runs on a cloud runner independent of any local machine state. That surfaced two real bugs: the workflow initially specified Node 20, but @supabase/supabase-js's realtime-js dependency requires Node 22+ for native WebSocket support and crashed immediately; and AniList's ~5000-result ceiling (documented in Entry 56) turned out to apply per year too — years 2018-2025 each hit a hard error on page 101 partway through, silently truncating those years at ~5000 titles each. The mirror finished with 126,927 titles total after both a Node-version fix and a month-level sub-partitioning fallback for any year that hits the ceiling.</w:t>
+      </w:r>
+    </w:p>
+    <w:p>
+      <w:r>
+        <w:t>Entry 56 approved and built the mirror scripts and daily-refresh workflow; running the actual backfill was left as the final step. Two local background runs of the mirror script died partway through — the first after safely writing 1900-2004 (14,816 created), the second almost instantly on resume — with no error in either case, consistent with the local session/machine itself being interrupted rather than a script bug (real time had advanced several days mid-conversation). A multi-hour job needs a runner that survives independently of the developer's machine staying awake, which GitHub Actions provides.</w:t>
+      </w:r>
+    </w:p>
+    <w:p>
+      <w:pPr>
+        <w:pStyle w:val="Heading2"/>
+      </w:pPr>
+      <w:r>
+        <w:t>Decision made</w:t>
+      </w:r>
+    </w:p>
+    <w:p>
+      <w:r>
+        <w:t>Added .github/workflows/mirror-anilist-catalog.yml (workflow_dispatch only, with start_year/end_year inputs so a re-run can target just the years that still need work instead of re-walking the whole catalog) and scripts/mirror-anilist-catalog.ts gained a START_YEAR/END_YEAR-aware year loop for the same reason. The first Actions run failed in ~5 seconds: createClient() from @supabase/supabase-js throws 'Node.js detected but native WebSocket not found' below Node 22 — both AniList-sync workflows (mirror and the existing daily refresh) were bumped from node-version: 20 to 22. The second Actions run reached year 2018 (~61k titles) before a page-101 HTTP 400 crashed the entire process — the script's per-page fetch is now wrapped so a single failed page logs and abandons just that year (or the undated pass) instead of taking down hours of accumulated progress, and a title that races into a 'unique constraint on anilistId' error (year-only FuzzyDateInt values like 20120000 satisfy two adjacent year ranges, so the same title can surface in two different year partitions) now falls back to an update instead of counting as a hard failure. The third Actions run completed successfully end to end (103,565 titles) but logged the page-101 ceiling for years 2018-2025 as a warning rather than an error, confirming those 8 years were each truncated. A new walkRange() helper is shared between the year-level pass and a month-level fallback: any year that hits the ceiling automatically re-walks itself month by month (comfortably under the per-query limit for a single year's manga release volume) instead of just logging a warning. A final targeted run (start_year=2018, end_year=2025) closed the gap cleanly with zero further ceiling hits at the month level, bringing the mirror to 126,927 titles.</w:t>
+      </w:r>
+    </w:p>
+    <w:p>
+      <w:pPr>
+        <w:pStyle w:val="Heading2"/>
+      </w:pPr>
+      <w:r>
+        <w:t>Why this decision was made</w:t>
+      </w:r>
+    </w:p>
+    <w:p>
+      <w:r>
+        <w:t>Moving the one-time backfill to GitHub Actions follows the same reasoning Entry 56 already used for the recurring daily refresh (Vercel's function timeout can't hold a multi-hour job) — it turned out to apply to the initial backfill too, and more urgently, once local execution proved unreliable across session boundaries. Making page-level failures non-fatal rather than adding more retries was the right fix because the observed HTTP 400 was consistent and structural (AniList's actual server-side page-depth limit), not transient — retrying the identical request would only ever fail the same way, so the fix needed to change what the script does with an unreachable page, not how hard it tries to reach it. Verified end-to-end against the live API and the production database rather than assumed: each fix was confirmed by re-running the actual workflow and checking real row counts before moving to the next one.</w:t>
       </w:r>
     </w:p>
     <w:p/>

</xml_diff>

<commit_message>
Journal: log Entry 58 — indexed search & real DB-level pagination
Documents the search/pagination performance pass on /titles: the
persisted GIN-indexed searchVector column, DESC NULLS LAST sort indexes,
dropping the live AniList browse blend, caching getDistinctGenres, and
the prisma db push index-dropping gotcha discovered mid-build.

Co-Authored-By: Claude Sonnet 5 <noreply@anthropic.com>
</commit_message>
<xml_diff>
--- a/Projectinformation/Development_Journal.docx
+++ b/Projectinformation/Development_Journal.docx
@@ -10754,6 +10754,129 @@
     <w:p>
       <w:r>
         <w:t>Moving the one-time backfill to GitHub Actions follows the same reasoning Entry 56 already used for the recurring daily refresh (Vercel's function timeout can't hold a multi-hour job) — it turned out to apply to the initial backfill too, and more urgently, once local execution proved unreliable across session boundaries. Making page-level failures non-fatal rather than adding more retries was the right fix because the observed HTTP 400 was consistent and structural (AniList's actual server-side page-depth limit), not transient — retrying the identical request would only ever fail the same way, so the fix needed to change what the script does with an unreachable page, not how hard it tries to reach it. Verified end-to-end against the live API and the production database rather than assumed: each fix was confirmed by re-running the actual workflow and checking real row counts before moving to the next one.</w:t>
+      </w:r>
+    </w:p>
+    <w:p/>
+    <w:p>
+      <w:pPr>
+        <w:pStyle w:val="Heading1"/>
+        <w:spacing w:before="360"/>
+      </w:pPr>
+      <w:r>
+        <w:t>Entry 58: Indexed Full-Text Search and Real DB-Level Pagination on /titles</w:t>
+      </w:r>
+    </w:p>
+    <w:p>
+      <w:pPr>
+        <w:spacing w:after="80"/>
+      </w:pPr>
+      <w:r>
+        <w:rPr>
+          <w:rStyle w:val="FieldLabel"/>
+        </w:rPr>
+        <w:t xml:space="preserve">Date: </w:t>
+      </w:r>
+      <w:r>
+        <w:t>2026-08-24</w:t>
+      </w:r>
+    </w:p>
+    <w:p>
+      <w:pPr>
+        <w:spacing w:after="80"/>
+      </w:pPr>
+      <w:r>
+        <w:rPr>
+          <w:rStyle w:val="FieldLabel"/>
+        </w:rPr>
+        <w:t xml:space="preserve">Type: </w:t>
+      </w:r>
+      <w:r>
+        <w:t>Decision</w:t>
+      </w:r>
+    </w:p>
+    <w:p>
+      <w:pPr>
+        <w:spacing w:after="80"/>
+      </w:pPr>
+      <w:r>
+        <w:rPr>
+          <w:rStyle w:val="FieldLabel"/>
+        </w:rPr>
+        <w:t xml:space="preserve">Status: </w:t>
+      </w:r>
+      <w:r>
+        <w:rPr>
+          <w:b/>
+          <w:color w:val="2E7D32"/>
+        </w:rPr>
+        <w:t>Resolved</w:t>
+      </w:r>
+    </w:p>
+    <w:p>
+      <w:pPr>
+        <w:spacing w:after="80"/>
+      </w:pPr>
+      <w:r>
+        <w:rPr>
+          <w:rStyle w:val="FieldLabel"/>
+        </w:rPr>
+        <w:t xml:space="preserve">Relates To: </w:t>
+      </w:r>
+      <w:r>
+        <w:t>Builds on Entry 56/57 (the full local mirror) — asked directly after that work finished: 'now we should be able to provide a faster search and efficient pagination right?'</w:t>
+      </w:r>
+    </w:p>
+    <w:p>
+      <w:pPr>
+        <w:pStyle w:val="Heading2"/>
+      </w:pPr>
+      <w:r>
+        <w:t>What this step was about</w:t>
+      </w:r>
+    </w:p>
+    <w:p>
+      <w:r>
+        <w:t>With the catalog fully mirrored locally (126,927 titles), /titles' search and browse got a real performance pass: a persisted, GIN-indexed full-text search column (searchVector) replaces computing to_tsvector() from scratch on every row on every query; sorting/pagination moved from an in-memory JS sort over a fixed take:100 cutoff (silently wrong beyond the first 100 matches) to real orderBy/skip/take at the DB level with Prev/Next controls; the live AniList blend that used to backstop missing titles was dropped as mostly-redundant overhead now that the mirror refreshes daily; and getDistinctGenres() (shared by /titles and /reviews) is now cached via unstable_cache after an unnest(genres) scan across every row was measured at ~6s uncached.</w:t>
+      </w:r>
+    </w:p>
+    <w:p>
+      <w:r>
+        <w:t>The user asked an exploratory question about whether search/pagination could now be faster given the completed mirror. Recommended and got approval for all three: (1) an indexed search column, (2) real DB-level sort+pagination, (3) dropping the live AniList blend. Implementing and verifying all three surfaced two further real bottlenecks not part of the original ask, fixed in the same pass since leaving them would have undermined the whole effort: getDistinctGenres()'s uncached unnest() scan, and four of the seven sort options being unusably slow (3-19s) even after adding what looked like the right index.</w:t>
+      </w:r>
+    </w:p>
+    <w:p>
+      <w:pPr>
+        <w:pStyle w:val="Heading2"/>
+      </w:pPr>
+      <w:r>
+        <w:t>Decision made</w:t>
+      </w:r>
+    </w:p>
+    <w:p>
+      <w:r>
+        <w:t>searchVector is a trigger-maintained tsvector column (BEFORE INSERT/UPDATE trigger, not a GENERATED ALWAYS AS column — Postgres requires the generation expression to be IMMUTABLE and to_tsvector() is only STABLE) with a GIN index, added via scripts/add-search-index.ts and declared Unsupported("tsvector") in schema.prisma for documentation only. title-search.ts's searchTitleIds() now just queries the indexed column directly. titles/page.tsx: every SORT_OPTIONS entry now carries a real Prisma orderBy (all seven map to genuine Title columns), findMany uses skip/take with a prisma.title.count() run in parallel for total-pages math, and Prev/Next links preserve every other filter param. The browseAniListMedia() blend and its UnifiedCard/compareCards machinery were deleted outright.</w:t>
+        <w:br/>
+        <w:br/>
+        <w:t>Four of the seven sort options (anilistAverageScore, anilistPopularity, communityScore, lastReviewedAt) use `orderBy: { col: { sort: "desc", nulls: "last" } }` — a plain ascending @@index does not satisfy that query shape, and Postgres fell back to a full sequential scan of every full-width row (synopsis text and array columns included) regardless of how many rows were actually null: confirmed via EXPLAIN ANALYZE that even anilistPopularity (non-null on essentially 100% of the 126,927 mirrored titles) still cost ~5s without a matching index. Prisma's @@index can't express NULLS ordering, so scripts/add-sort-indexes.ts creates four `col DESC NULLS LAST` indexes via raw SQL, same pattern as the search index. certifiedBangerCount and discussionCount (never null) got plain @@index entries instead, which fully satisfy their simple `desc` sort.</w:t>
+        <w:br/>
+        <w:br/>
+        <w:t>getDistinctGenres() is now wrapped in unstable_cache with a 1-hour revalidate window — the `use cache` directive would have required flipping on the project-wide cacheComponents config flag, a bigger and riskier change than a single slow query justified; unstable_cache is Next's own documented choice for data that needs to persist across Vercel's ephemeral serverless invocations, which `use cache`'s default in-memory handler explicitly does not guarantee on serverless.</w:t>
+        <w:br/>
+        <w:br/>
+        <w:t>A real, non-obvious gotcha was hit and is now documented in schema.prisma and both scripts' headers: `prisma db push` silently drops the GIN/DESC-NULLS-LAST indexes (and would drop a trigger the same way) whenever they have no corresponding @@index declaration, even though the underlying column itself is safely marked Unsupported and left alone. This was discovered mid-build when a second db push (to remove now-redundant plain indexes) silently reverted the just-added search index back to a full seq scan; scripts/add-search-index.ts and scripts/add-sort-indexes.ts are idempotent and must be re-run after any future db push.</w:t>
+      </w:r>
+    </w:p>
+    <w:p>
+      <w:pPr>
+        <w:pStyle w:val="Heading2"/>
+      </w:pPr>
+      <w:r>
+        <w:t>Why this decision was made</w:t>
+      </w:r>
+    </w:p>
+    <w:p>
+      <w:r>
+        <w:t>Every fix here was verified against the real 126,927-row production database via EXPLAIN ANALYZE and direct timing, not assumed from theory — consistent with this project's established discipline of confirming external/infrastructure behavior empirically rather than guessing (the same discipline that caught AniList's pagination ceiling in Entry 56). unstable_cache over `use cache` was chosen specifically because this app deploys to Vercel's serverless environment, where `use cache`'s documented default behavior ("cache entries typically don't persist across requests" on serverless) would not have actually fixed the problem being solved. The db-push-drops-raw-SQL-indexes discovery was caught by re-testing after every change rather than trusting the first fix — the search index looked correct immediately after creation (confirmed via EXPLAIN) and was silently broken by an unrelated later step, which would have shipped as a regression without that re-verification.</w:t>
       </w:r>
     </w:p>
     <w:p/>

</xml_diff>

<commit_message>
Journal: log Entry 59 — fix slow genre-filtered browse
Co-Authored-By: Claude Sonnet 5 <noreply@anthropic.com>
</commit_message>
<xml_diff>
--- a/Projectinformation/Development_Journal.docx
+++ b/Projectinformation/Development_Journal.docx
@@ -10877,6 +10877,120 @@
     <w:p>
       <w:r>
         <w:t>Every fix here was verified against the real 126,927-row production database via EXPLAIN ANALYZE and direct timing, not assumed from theory — consistent with this project's established discipline of confirming external/infrastructure behavior empirically rather than guessing (the same discipline that caught AniList's pagination ceiling in Entry 56). unstable_cache over `use cache` was chosen specifically because this app deploys to Vercel's serverless environment, where `use cache`'s documented default behavior ("cache entries typically don't persist across requests" on serverless) would not have actually fixed the problem being solved. The db-push-drops-raw-SQL-indexes discovery was caught by re-testing after every change rather than trusting the first fix — the search index looked correct immediately after creation (confirmed via EXPLAIN) and was silently broken by an unrelated later step, which would have shipped as a regression without that re-verification.</w:t>
+      </w:r>
+    </w:p>
+    <w:p/>
+    <w:p>
+      <w:pPr>
+        <w:pStyle w:val="Heading1"/>
+        <w:spacing w:before="360"/>
+      </w:pPr>
+      <w:r>
+        <w:t>Entry 59: Fix: Slow Genre-Filtered Browse (Missing GIN Index on Title.genres)</w:t>
+      </w:r>
+    </w:p>
+    <w:p>
+      <w:pPr>
+        <w:spacing w:after="80"/>
+      </w:pPr>
+      <w:r>
+        <w:rPr>
+          <w:rStyle w:val="FieldLabel"/>
+        </w:rPr>
+        <w:t xml:space="preserve">Date: </w:t>
+      </w:r>
+      <w:r>
+        <w:t>2026-08-24</w:t>
+      </w:r>
+    </w:p>
+    <w:p>
+      <w:pPr>
+        <w:spacing w:after="80"/>
+      </w:pPr>
+      <w:r>
+        <w:rPr>
+          <w:rStyle w:val="FieldLabel"/>
+        </w:rPr>
+        <w:t xml:space="preserve">Type: </w:t>
+      </w:r>
+      <w:r>
+        <w:t>Bug</w:t>
+      </w:r>
+    </w:p>
+    <w:p>
+      <w:pPr>
+        <w:spacing w:after="80"/>
+      </w:pPr>
+      <w:r>
+        <w:rPr>
+          <w:rStyle w:val="FieldLabel"/>
+        </w:rPr>
+        <w:t xml:space="preserve">Status: </w:t>
+      </w:r>
+      <w:r>
+        <w:rPr>
+          <w:b/>
+          <w:color w:val="2E7D32"/>
+        </w:rPr>
+        <w:t>Resolved</w:t>
+      </w:r>
+    </w:p>
+    <w:p>
+      <w:pPr>
+        <w:spacing w:after="80"/>
+      </w:pPr>
+      <w:r>
+        <w:rPr>
+          <w:rStyle w:val="FieldLabel"/>
+        </w:rPr>
+        <w:t xml:space="preserve">Relates To: </w:t>
+      </w:r>
+      <w:r>
+        <w:t>Entry 58 (the search/pagination performance pass) — same root cause class, a filter/sort column left unindexed at the mirror's real scale.</w:t>
+      </w:r>
+    </w:p>
+    <w:p>
+      <w:pPr>
+        <w:pStyle w:val="Heading2"/>
+      </w:pPr>
+      <w:r>
+        <w:t>What this step was about</w:t>
+      </w:r>
+    </w:p>
+    <w:p>
+      <w:r>
+        <w:t>User-reported: filtering /titles by a genre (e.g. Adventure) took 4-5s to load, on every page including page 2+. Title.genres (a string array, filtered via Prisma's `has`/Postgres `@&gt;` containment) had no index, so prisma.title.count() — run on every page load to compute the 'page X of Y' total — forced a full sequential scan of all 126,927 full-width rows regardless of which page was requested. Added a GIN index; warm count() dropped from ~9.6s to ~55ms.</w:t>
+      </w:r>
+    </w:p>
+    <w:p>
+      <w:r>
+        <w:t>Reported right after Entry 58 shipped. Entry 58's own writeup had already flagged this exact gap in passing (an unindexed genres array filter) as a known-but-deferred risk, scoped out at the time because the user's ask was specifically search+pagination+dropping the AniList blend. It surfaced as a real bug within the same session once someone actually used the genre filter against the full 126k-row catalog.</w:t>
+      </w:r>
+    </w:p>
+    <w:p>
+      <w:pPr>
+        <w:pStyle w:val="Heading2"/>
+      </w:pPr>
+      <w:r>
+        <w:t>Decision made</w:t>
+      </w:r>
+    </w:p>
+    <w:p>
+      <w:r>
+        <w:t>Added `@@index([genres], type: Gin)` to the Title model in schema.prisma and pushed via the session pooler (same DDL-needs-session-locks reasoning as every other schema push this project has done). Unlike the Entry 58 search/sort indexes, this one IS expressible through Prisma's schema DSL (GIN index type is natively supported for Postgres array columns), so it didn't need a raw-SQL script — but since it still went through `prisma db push`, and db push is now confirmed (Entry 58) to drop any raw-SQL-created, schema-undeclared indexes as drift, scripts/add-search-index.ts and scripts/add-sort-indexes.ts had to be (and were) re-run immediately after this push to restore what it would otherwise have silently broken again.</w:t>
+      </w:r>
+    </w:p>
+    <w:p>
+      <w:pPr>
+        <w:pStyle w:val="Heading2"/>
+      </w:pPr>
+      <w:r>
+        <w:t>Why this decision was made</w:t>
+      </w:r>
+    </w:p>
+    <w:p>
+      <w:r>
+        <w:t>Same diagnosis method as Entry 58: confirmed via EXPLAIN ANALYZE that the query was doing a Seq Scan before concluding an index was the fix, rather than guessing. Chose a plain GIN index (not a partial/expression index) since genre values aren't null-heavy or skewed toward one dominant value the way communityScore/lastReviewedAt were in Entry 58 — a standard array-containment GIN index is the correct, unremarkable fix here.</w:t>
       </w:r>
     </w:p>
     <w:p/>

</xml_diff>

<commit_message>
Journal: log Entry 60 — fix intermittently slow homepage
Co-Authored-By: Claude Sonnet 5 <noreply@anthropic.com>
</commit_message>
<xml_diff>
--- a/Projectinformation/Development_Journal.docx
+++ b/Projectinformation/Development_Journal.docx
@@ -29,7 +29,7 @@
         <w:jc w:val="center"/>
       </w:pPr>
       <w:r>
-        <w:t>Generated 2026-08-24</w:t>
+        <w:t>Generated 2026-08-25</w:t>
       </w:r>
     </w:p>
     <w:p/>
@@ -10991,6 +10991,120 @@
     <w:p>
       <w:r>
         <w:t>Same diagnosis method as Entry 58: confirmed via EXPLAIN ANALYZE that the query was doing a Seq Scan before concluding an index was the fix, rather than guessing. Chose a plain GIN index (not a partial/expression index) since genre values aren't null-heavy or skewed toward one dominant value the way communityScore/lastReviewedAt were in Entry 58 — a standard array-containment GIN index is the correct, unremarkable fix here.</w:t>
+      </w:r>
+    </w:p>
+    <w:p/>
+    <w:p>
+      <w:pPr>
+        <w:pStyle w:val="Heading1"/>
+        <w:spacing w:before="360"/>
+      </w:pPr>
+      <w:r>
+        <w:t>Entry 60: Fix: Intermittently Slow Homepage (Precompute Distinct Genres Daily)</w:t>
+      </w:r>
+    </w:p>
+    <w:p>
+      <w:pPr>
+        <w:spacing w:after="80"/>
+      </w:pPr>
+      <w:r>
+        <w:rPr>
+          <w:rStyle w:val="FieldLabel"/>
+        </w:rPr>
+        <w:t xml:space="preserve">Date: </w:t>
+      </w:r>
+      <w:r>
+        <w:t>2026-08-25</w:t>
+      </w:r>
+    </w:p>
+    <w:p>
+      <w:pPr>
+        <w:spacing w:after="80"/>
+      </w:pPr>
+      <w:r>
+        <w:rPr>
+          <w:rStyle w:val="FieldLabel"/>
+        </w:rPr>
+        <w:t xml:space="preserve">Type: </w:t>
+      </w:r>
+      <w:r>
+        <w:t>Bug</w:t>
+      </w:r>
+    </w:p>
+    <w:p>
+      <w:pPr>
+        <w:spacing w:after="80"/>
+      </w:pPr>
+      <w:r>
+        <w:rPr>
+          <w:rStyle w:val="FieldLabel"/>
+        </w:rPr>
+        <w:t xml:space="preserve">Status: </w:t>
+      </w:r>
+      <w:r>
+        <w:rPr>
+          <w:b/>
+          <w:color w:val="2E7D32"/>
+        </w:rPr>
+        <w:t>Resolved</w:t>
+      </w:r>
+    </w:p>
+    <w:p>
+      <w:pPr>
+        <w:spacing w:after="80"/>
+      </w:pPr>
+      <w:r>
+        <w:rPr>
+          <w:rStyle w:val="FieldLabel"/>
+        </w:rPr>
+        <w:t xml:space="preserve">Relates To: </w:t>
+      </w:r>
+      <w:r>
+        <w:t>Entry 58 (added unstable_cache around getDistinctGenres, which reduced but did not eliminate this) and Entry 59 (same root-cause family, a different unindexed genres-array query pattern).</w:t>
+      </w:r>
+    </w:p>
+    <w:p>
+      <w:pPr>
+        <w:pStyle w:val="Heading2"/>
+      </w:pPr>
+      <w:r>
+        <w:t>What this step was about</w:t>
+      </w:r>
+    </w:p>
+    <w:p>
+      <w:r>
+        <w:t>User-reported: the homepage sometimes took 5+ seconds to load. Every other homepage query was already fast (Entry 58's DESC NULLS LAST sort indexes), but getDistinctGenres() could still occasionally cost ~6s: no index — not even Entry 59's new GIN index on genres — speeds up 'list every distinct array element across the whole table' the way a GIN index speeds up containment checks (`@&gt;`). Entry 58's unstable_cache wrapper reduced how often the query ran but not its cost, so any cache miss (a cold serverless instance, or the 1-hour revalidate window lapsing) still made one unlucky request pay the full scan. The distinct genre list — 19 values across 126,927 titles — is now precomputed once a day by scripts/refresh-anilist-catalog.ts and stored on the PlatformSettings singleton row; the app reads it as a single indexed row lookup, removing the expensive query from the request path entirely rather than caching around it.</w:t>
+      </w:r>
+    </w:p>
+    <w:p>
+      <w:r>
+        <w:t>Reported the day after Entry 59 shipped, once the earlier genre-browse fix had already been verified live. Confirmed via direct timing that every other homepage query was in the tens-to-hundreds-of-milliseconds range and getDistinctGenres() alone accounted for the multi-second tail.</w:t>
+      </w:r>
+    </w:p>
+    <w:p>
+      <w:pPr>
+        <w:pStyle w:val="Heading2"/>
+      </w:pPr>
+      <w:r>
+        <w:t>Decision made</w:t>
+      </w:r>
+    </w:p>
+    <w:p>
+      <w:r>
+        <w:t>Added `distinctGenres String[] @default([])` to the PlatformSettings model — an odd fit for a table otherwise reserved for admin-tunable config, called out explicitly in both the schema comment and the admin settings action's untouched partial-update pattern (updateSettings() only ever touches its own specific fields, so it can't clobber this). scripts/refresh-anilist-catalog.ts gained a third pass, after refreshing existing titles and discovering new ones, that recomputes the distinct-genre list and upserts it onto the singleton row. src/lib/genres.ts's getDistinctGenres() was rewritten to a plain findUnique + select, dropping both the raw unnest() query and the unstable_cache wrapper entirely — there's nothing left worth caching once the read itself is already a single indexed row. Backfilled immediately via a one-off script rather than waiting for the next scheduled daily run.</w:t>
+      </w:r>
+    </w:p>
+    <w:p>
+      <w:pPr>
+        <w:pStyle w:val="Heading2"/>
+      </w:pPr>
+      <w:r>
+        <w:t>Why this decision was made</w:t>
+      </w:r>
+    </w:p>
+    <w:p>
+      <w:r>
+        <w:t>Caching a slow query only moves the cost around (to whichever request loses the cache-miss race) — it doesn't remove it, which is exactly why Entry 58's fix for this same query was necessary but insufficient. Genres are a small, AniList-taxonomy-bounded set that essentially never needs same-day freshness (the whole reason Entry 56 tolerates a once-daily refresh for the entire catalog in the first place), making 'precompute once a day, read instantly the rest of the time' strictly better than 'cache for an hour and eat the occasional full cost' for this specific case.</w:t>
       </w:r>
     </w:p>
     <w:p/>

</xml_diff>

<commit_message>
Journal: log Entry 61 — fix slow title detail pages
Co-Authored-By: Claude Sonnet 5 <noreply@anthropic.com>
</commit_message>
<xml_diff>
--- a/Projectinformation/Development_Journal.docx
+++ b/Projectinformation/Development_Journal.docx
@@ -11105,6 +11105,123 @@
     <w:p>
       <w:r>
         <w:t>Caching a slow query only moves the cost around (to whichever request loses the cache-miss race) — it doesn't remove it, which is exactly why Entry 58's fix for this same query was necessary but insufficient. Genres are a small, AniList-taxonomy-bounded set that essentially never needs same-day freshness (the whole reason Entry 56 tolerates a once-daily refresh for the entire catalog in the first place), making 'precompute once a day, read instantly the rest of the time' strictly better than 'cache for an hour and eat the occasional full cost' for this specific case.</w:t>
+      </w:r>
+    </w:p>
+    <w:p/>
+    <w:p>
+      <w:pPr>
+        <w:pStyle w:val="Heading1"/>
+        <w:spacing w:before="360"/>
+      </w:pPr>
+      <w:r>
+        <w:t>Entry 61: Fix: Slow Title Detail Pages (Redundant Auth Calls, Serial Queries)</w:t>
+      </w:r>
+    </w:p>
+    <w:p>
+      <w:pPr>
+        <w:spacing w:after="80"/>
+      </w:pPr>
+      <w:r>
+        <w:rPr>
+          <w:rStyle w:val="FieldLabel"/>
+        </w:rPr>
+        <w:t xml:space="preserve">Date: </w:t>
+      </w:r>
+      <w:r>
+        <w:t>2026-08-25</w:t>
+      </w:r>
+    </w:p>
+    <w:p>
+      <w:pPr>
+        <w:spacing w:after="80"/>
+      </w:pPr>
+      <w:r>
+        <w:rPr>
+          <w:rStyle w:val="FieldLabel"/>
+        </w:rPr>
+        <w:t xml:space="preserve">Type: </w:t>
+      </w:r>
+      <w:r>
+        <w:t>Bug</w:t>
+      </w:r>
+    </w:p>
+    <w:p>
+      <w:pPr>
+        <w:spacing w:after="80"/>
+      </w:pPr>
+      <w:r>
+        <w:rPr>
+          <w:rStyle w:val="FieldLabel"/>
+        </w:rPr>
+        <w:t xml:space="preserve">Status: </w:t>
+      </w:r>
+      <w:r>
+        <w:rPr>
+          <w:b/>
+          <w:color w:val="2E7D32"/>
+        </w:rPr>
+        <w:t>Resolved</w:t>
+      </w:r>
+    </w:p>
+    <w:p>
+      <w:pPr>
+        <w:spacing w:after="80"/>
+      </w:pPr>
+      <w:r>
+        <w:rPr>
+          <w:rStyle w:val="FieldLabel"/>
+        </w:rPr>
+        <w:t xml:space="preserve">Relates To: </w:t>
+      </w:r>
+      <w:r>
+        <w:t>Entries 58-60 (the search/pagination/homepage performance passes) — a different root-cause family this time: not missing indexes on the mirrored catalog, but redundant network round-trips.</w:t>
+      </w:r>
+    </w:p>
+    <w:p>
+      <w:pPr>
+        <w:pStyle w:val="Heading2"/>
+      </w:pPr>
+      <w:r>
+        <w:t>What this step was about</w:t>
+      </w:r>
+    </w:p>
+    <w:p>
+      <w:r>
+        <w:t>User-reported: /titles/[id] consistently took 1-3s to load, unlike the browse/homepage pages already fixed. Direct timing of every individual query on the page showed each one in the tens-to-low-hundreds of milliseconds — the actual cost was two compounding sources of redundant/serial network round-trips. First: supabase.auth.getUser() always makes a real network call to Supabase's Auth server (by design, unlike getSession()), and Header (rendered on every page) plus the title page itself plus checkReviewGate() (for first-time reviewers) each called it independently — up to three separate Auth round-trips in one request, none of them deduplicated. Second: for a logged-in user, four page-specific queries (existingReview, libraryEntry, the review gate check, userVotes) ran one after another instead of in parallel.</w:t>
+      </w:r>
+    </w:p>
+    <w:p>
+      <w:r>
+        <w:t>Reported the day after Entry 60. By this point every prior fix in this run of performance reports had been about an unindexed query against the 126k-row mirrored catalog; this one wasn't — Title/Review/LibraryEntry are all small, already-indexed tables, so the diagnosis had to look past 'is a query slow' to 'how many round-trips does this page make, and are they serialized.'</w:t>
+      </w:r>
+    </w:p>
+    <w:p>
+      <w:pPr>
+        <w:pStyle w:val="Heading2"/>
+      </w:pPr>
+      <w:r>
+        <w:t>Decision made</w:t>
+      </w:r>
+    </w:p>
+    <w:p>
+      <w:r>
+        <w:t>src/lib/auth.ts: extracted getAuthUser() (just the raw Supabase auth.getUser() call) wrapped in React's cache(), and getCurrentUser() (the app-User-joined version) now calls it instead of creating its own Supabase client. review-gate.ts's checkReviewGate() was switched from its own createClient()+getUser() call to the same shared getAuthUser() — collapsing what could be three independent Auth network calls into one memoized-per-request call, reused by Header, any page needing the user, and the review gate.</w:t>
+        <w:br/>
+        <w:br/>
+        <w:t>titles/[id]/page.tsx was restructured from up to six sequential stages (title, then a 4-query Promise.all, then existingReview, then libraryEntry, then the gate check, then userVotes) down to three: title+user fetched together (independent of each other), then a single batch (categories, reviews, libraryStats, existingReview, libraryEntry, and the gate check — none of which depend on each other or on the reviews list itself), then userVotes last (the only piece that genuinely needs review ids from the batch). The gate check now always runs in that batch instead of being conditionally skipped when existingReview is truthy — behaviorally identical, since checkReviewGate's own first check (a user's global review count) already short-circuits to {allowed:true} whenever a review already exists for this title, so the 'unconditional' version can never produce a different result, only different timing.</w:t>
+      </w:r>
+    </w:p>
+    <w:p>
+      <w:pPr>
+        <w:pStyle w:val="Heading2"/>
+      </w:pPr>
+      <w:r>
+        <w:t>Why this decision was made</w:t>
+      </w:r>
+    </w:p>
+    <w:p>
+      <w:r>
+        <w:t>Confirmed via direct DB-level timing before touching any code that no individual query was the bottleneck (each ran in well under 500ms), which ruled out another missing-index fix and pointed at request structure instead. React's cache() is the standard, low-risk fix for exactly this shape of problem (multiple components in one render tree independently needing the same per-request-stable value) and required no behavior change, only a memoization boundary. The Promise.all restructuring was verified safe by explicitly reasoning through the one place a dependency looked implicit (the gate check's conditioning on existingReview) rather than assuming parallelizing was safe by default.</w:t>
       </w:r>
     </w:p>
     <w:p/>

</xml_diff>

<commit_message>
Journal: log Entry 62 — pin Vercel functions to fra1
Co-Authored-By: Claude Sonnet 5 <noreply@anthropic.com>
</commit_message>
<xml_diff>
--- a/Projectinformation/Development_Journal.docx
+++ b/Projectinformation/Development_Journal.docx
@@ -11222,6 +11222,217 @@
     <w:p>
       <w:r>
         <w:t>Confirmed via direct DB-level timing before touching any code that no individual query was the bottleneck (each ran in well under 500ms), which ruled out another missing-index fix and pointed at request structure instead. React's cache() is the standard, low-risk fix for exactly this shape of problem (multiple components in one render tree independently needing the same per-request-stable value) and required no behavior change, only a memoization boundary. The Promise.all restructuring was verified safe by explicitly reasoning through the one place a dependency looked implicit (the gate check's conditioning on existingReview) rather than assuming parallelizing was safe by default.</w:t>
+      </w:r>
+    </w:p>
+    <w:p/>
+    <w:p>
+      <w:pPr>
+        <w:pStyle w:val="Heading1"/>
+        <w:spacing w:before="360"/>
+      </w:pPr>
+      <w:r>
+        <w:t>Entry 62: Pin Vercel Functions to fra1 — Closing a Region-Mismatch Latency Gap</w:t>
+      </w:r>
+    </w:p>
+    <w:p>
+      <w:pPr>
+        <w:spacing w:after="80"/>
+      </w:pPr>
+      <w:r>
+        <w:rPr>
+          <w:rStyle w:val="FieldLabel"/>
+        </w:rPr>
+        <w:t xml:space="preserve">Date: </w:t>
+      </w:r>
+      <w:r>
+        <w:t>2026-08-25</w:t>
+      </w:r>
+    </w:p>
+    <w:p>
+      <w:pPr>
+        <w:spacing w:after="80"/>
+      </w:pPr>
+      <w:r>
+        <w:rPr>
+          <w:rStyle w:val="FieldLabel"/>
+        </w:rPr>
+        <w:t xml:space="preserve">Type: </w:t>
+      </w:r>
+      <w:r>
+        <w:t>Decision</w:t>
+      </w:r>
+    </w:p>
+    <w:p>
+      <w:pPr>
+        <w:spacing w:after="80"/>
+      </w:pPr>
+      <w:r>
+        <w:rPr>
+          <w:rStyle w:val="FieldLabel"/>
+        </w:rPr>
+        <w:t xml:space="preserve">Status: </w:t>
+      </w:r>
+      <w:r>
+        <w:rPr>
+          <w:b/>
+          <w:color w:val="2E7D32"/>
+        </w:rPr>
+        <w:t>Resolved</w:t>
+      </w:r>
+    </w:p>
+    <w:p>
+      <w:pPr>
+        <w:spacing w:after="80"/>
+      </w:pPr>
+      <w:r>
+        <w:rPr>
+          <w:rStyle w:val="FieldLabel"/>
+        </w:rPr>
+        <w:t xml:space="preserve">Relates To: </w:t>
+      </w:r>
+      <w:r>
+        <w:t>Entry 61 (the title-page latency fix) — asked directly afterward whether Vercel itself, not the app/DB layer, could be contributing to remaining load times.</w:t>
+      </w:r>
+    </w:p>
+    <w:p>
+      <w:pPr>
+        <w:pStyle w:val="Heading2"/>
+      </w:pPr>
+      <w:r>
+        <w:t>What this step was about</w:t>
+      </w:r>
+    </w:p>
+    <w:p>
+      <w:r>
+        <w:t>After Entries 58-61 fixed every genuinely slow/redundant query and Auth call, title pages on the live Vercel deployment still ran noticeably slower than the identical code running on localhost against the same Supabase database (~0.5-0.85s vs ~0.23s). Diagnosed by running the app locally with the same production Supabase credentials and directly comparing response times side by side. The X-Vercel-Id response header showed requests entering through Vercel's Frankfurt edge (fra1) but executing in iad1 (US East, Washington D.C.), while Supabase is hosted in eu-west-1 (Ireland) — every database query was paying a transatlantic round-trip. Pinning Vercel's serverless functions to fra1 via vercel.json closed the gap almost entirely: warm requests now run ~0.24-0.37s on Vercel, matching localhost.</w:t>
+      </w:r>
+    </w:p>
+    <w:p>
+      <w:r>
+        <w:t>The user's own suspicion ('could it be vercel itself that is slow? let's try to run it localhost and connect to supabase') was the direct trigger and correct diagnostic instinct — this project has no separate dev database (localhost has always pointed at the same production Supabase instance since early in the project), which made an apples-to-apples localhost-vs-Vercel comparison possible without any extra setup.</w:t>
+      </w:r>
+    </w:p>
+    <w:p>
+      <w:pPr>
+        <w:pStyle w:val="Heading2"/>
+      </w:pPr>
+      <w:r>
+        <w:t>Options considered</w:t>
+      </w:r>
+    </w:p>
+    <w:tbl>
+      <w:tblPr>
+        <w:tblStyle w:val="LightGrid-Accent1"/>
+        <w:tblW w:type="auto" w:w="0"/>
+        <w:tblLayout w:type="autofit"/>
+        <w:tblLook w:firstColumn="1" w:firstRow="1" w:lastColumn="0" w:lastRow="0" w:noHBand="0" w:noVBand="1" w:val="04A0"/>
+      </w:tblPr>
+      <w:tblGrid>
+        <w:gridCol w:w="4680"/>
+        <w:gridCol w:w="4680"/>
+      </w:tblGrid>
+      <w:tr>
+        <w:tc>
+          <w:tcPr>
+            <w:tcW w:type="dxa" w:w="4680"/>
+          </w:tcPr>
+          <w:p>
+            <w:r>
+              <w:rPr>
+                <w:b/>
+              </w:rPr>
+              <w:t>Option Considered</w:t>
+            </w:r>
+          </w:p>
+        </w:tc>
+        <w:tc>
+          <w:tcPr>
+            <w:tcW w:type="dxa" w:w="4680"/>
+          </w:tcPr>
+          <w:p>
+            <w:r>
+              <w:rPr>
+                <w:b/>
+              </w:rPr>
+              <w:t>Description</w:t>
+            </w:r>
+          </w:p>
+        </w:tc>
+      </w:tr>
+      <w:tr>
+        <w:tc>
+          <w:tcPr>
+            <w:tcW w:type="dxa" w:w="4680"/>
+          </w:tcPr>
+          <w:p>
+            <w:r>
+              <w:t>fra1 (Frankfurt) — chosen</w:t>
+            </w:r>
+          </w:p>
+        </w:tc>
+        <w:tc>
+          <w:tcPr>
+            <w:tcW w:type="dxa" w:w="4680"/>
+          </w:tcPr>
+          <w:p>
+            <w:r>
+              <w:t>Already where this project's edge traffic enters, a large/well-established Vercel region.</w:t>
+            </w:r>
+          </w:p>
+        </w:tc>
+      </w:tr>
+      <w:tr>
+        <w:tc>
+          <w:tcPr>
+            <w:tcW w:type="dxa" w:w="4680"/>
+          </w:tcPr>
+          <w:p>
+            <w:r>
+              <w:t>dub1 (Dublin)</w:t>
+            </w:r>
+          </w:p>
+        </w:tc>
+        <w:tc>
+          <w:tcPr>
+            <w:tcW w:type="dxa" w:w="4680"/>
+          </w:tcPr>
+          <w:p>
+            <w:r>
+              <w:t>Geographically closest Vercel region to Supabase's eu-west-1, but smaller/less common; not chosen given fra1 already tested out effectively equivalent.</w:t>
+            </w:r>
+          </w:p>
+        </w:tc>
+      </w:tr>
+    </w:tbl>
+    <w:p>
+      <w:pPr>
+        <w:spacing w:after="120"/>
+      </w:pPr>
+    </w:p>
+    <w:p>
+      <w:pPr>
+        <w:pStyle w:val="Heading2"/>
+      </w:pPr>
+      <w:r>
+        <w:t>Decision made</w:t>
+      </w:r>
+    </w:p>
+    <w:p>
+      <w:r>
+        <w:t>Added `"regions": ["fra1"]` to vercel.json. Verified via the X-Vercel-Id response header (format `&lt;edge-region&gt;::&lt;function-region&gt;::&lt;id&gt;`) that it changed from `fra1::iad1::...` to `fra1::fra1::...` after redeploy, and via direct timing (interleaved localhost/Vercel requests for the same title, before and after) that warm response times dropped from ~0.5-0.85s to ~0.24-0.37s, closing to within the same range as localhost.</w:t>
+      </w:r>
+    </w:p>
+    <w:p>
+      <w:pPr>
+        <w:pStyle w:val="Heading2"/>
+      </w:pPr>
+      <w:r>
+        <w:t>Why this decision was made</w:t>
+      </w:r>
+    </w:p>
+    <w:p>
+      <w:r>
+        <w:t>Diagnosed empirically rather than assumed — the localhost-vs-Vercel comparison and the X-Vercel-Id header gave direct, unambiguous evidence of both the problem (region mismatch) and the fix (region pin closing the gap), consistent with this project's established discipline of verifying infrastructure behavior against reality rather than guessing. fra1 over dub1 was a low-stakes choice since both are within the same broad European region as eu-west-1 and the measured improvement with fra1 was already close to eliminating the gap entirely; there was no indication dub1 would meaningfully outperform it.</w:t>
       </w:r>
     </w:p>
     <w:p/>

</xml_diff>

<commit_message>
Journal: log Entry 63 — cleanup pass (dead code, landmine script, db-push safety)
Co-Authored-By: Claude Sonnet 5 <noreply@anthropic.com>
</commit_message>
<xml_diff>
--- a/Projectinformation/Development_Journal.docx
+++ b/Projectinformation/Development_Journal.docx
@@ -11433,6 +11433,120 @@
     <w:p>
       <w:r>
         <w:t>Diagnosed empirically rather than assumed — the localhost-vs-Vercel comparison and the X-Vercel-Id header gave direct, unambiguous evidence of both the problem (region mismatch) and the fix (region pin closing the gap), consistent with this project's established discipline of verifying infrastructure behavior against reality rather than guessing. fra1 over dub1 was a low-stakes choice since both are within the same broad European region as eu-west-1 and the measured improvement with fra1 was already close to eliminating the gap entirely; there was no indication dub1 would meaningfully outperform it.</w:t>
+      </w:r>
+    </w:p>
+    <w:p/>
+    <w:p>
+      <w:pPr>
+        <w:pStyle w:val="Heading1"/>
+        <w:spacing w:before="360"/>
+      </w:pPr>
+      <w:r>
+        <w:t>Entry 63: Code Cleanup Pass: Dead Code, a Landmine Script, and a db-push Safety Wrapper</w:t>
+      </w:r>
+    </w:p>
+    <w:p>
+      <w:pPr>
+        <w:spacing w:after="80"/>
+      </w:pPr>
+      <w:r>
+        <w:rPr>
+          <w:rStyle w:val="FieldLabel"/>
+        </w:rPr>
+        <w:t xml:space="preserve">Date: </w:t>
+      </w:r>
+      <w:r>
+        <w:t>2026-08-25</w:t>
+      </w:r>
+    </w:p>
+    <w:p>
+      <w:pPr>
+        <w:spacing w:after="80"/>
+      </w:pPr>
+      <w:r>
+        <w:rPr>
+          <w:rStyle w:val="FieldLabel"/>
+        </w:rPr>
+        <w:t xml:space="preserve">Type: </w:t>
+      </w:r>
+      <w:r>
+        <w:t>Decision</w:t>
+      </w:r>
+    </w:p>
+    <w:p>
+      <w:pPr>
+        <w:spacing w:after="80"/>
+      </w:pPr>
+      <w:r>
+        <w:rPr>
+          <w:rStyle w:val="FieldLabel"/>
+        </w:rPr>
+        <w:t xml:space="preserve">Status: </w:t>
+      </w:r>
+      <w:r>
+        <w:rPr>
+          <w:b/>
+          <w:color w:val="2E7D32"/>
+        </w:rPr>
+        <w:t>Resolved</w:t>
+      </w:r>
+    </w:p>
+    <w:p>
+      <w:pPr>
+        <w:spacing w:after="80"/>
+      </w:pPr>
+      <w:r>
+        <w:rPr>
+          <w:rStyle w:val="FieldLabel"/>
+        </w:rPr>
+        <w:t xml:space="preserve">Relates To: </w:t>
+      </w:r>
+      <w:r>
+        <w:t>Follows the Entry 58-62 performance-fix spree — the user asked for a general code-quality audit and cleanup afterward. Directly touches Entry 52 (the architecture that left the dead code and the landmine script behind), Entry 56 (which reversed it), and Entry 58 (which documented the db-push-drops-indexes gotcha this entry now guards against).</w:t>
+      </w:r>
+    </w:p>
+    <w:p>
+      <w:pPr>
+        <w:pStyle w:val="Heading2"/>
+      </w:pPr>
+      <w:r>
+        <w:t>What this step was about</w:t>
+      </w:r>
+    </w:p>
+    <w:p>
+      <w:r>
+        <w:t>Ran a broad code-quality audit (dead code, leftover artifacts, perf gaps matching the pattern already fixed, duplication, type safety, schema hygiene) and picked four low-risk, verified-safe findings to act on immediately, deferring two medium-effort ones (real /reviews pagination, extracting the filter form shared across /titles /reviews and the homepage) for later. Deleted a genuinely dangerous leftover migration script, removed ~180 lines of confirmed-dead code, added a missing index proactively, and closed the last remaining gap in the db-push index-dropping gotcha by making the safe re-index sequence the default path instead of a documented-but-manual one.</w:t>
+      </w:r>
+    </w:p>
+    <w:p>
+      <w:r>
+        <w:t>The audit was run as a background fork so its exploration didn't consume the main conversation's context, then its ~20 candidate findings were narrowed to a ranked, concrete list and presented to the user for a scoping decision rather than acted on unilaterally. The user picked the bundled 'quick fixes' option, declining (for now) the two medium-effort items.</w:t>
+      </w:r>
+    </w:p>
+    <w:p>
+      <w:pPr>
+        <w:pStyle w:val="Heading2"/>
+      </w:pPr>
+      <w:r>
+        <w:t>Decision made</w:t>
+      </w:r>
+    </w:p>
+    <w:p>
+      <w:r>
+        <w:t>Deleted scripts/null-anilist-linked-metadata.ts outright — an Entry-52 migration that nulls every AniList-linked title's synopsis/genres/scores/etc. for an architecture Entry 56 reversed two entries later; left in place with a plausible-looking name and no npm script pointing at it, running it today would have silently destroyed the exact columns Entries 58-62 built indexed search and sort on top of. Removed four confirmed-dead exports from src/lib/anilist.ts (browseAniListMedia, getAniListMediaByIds, getAniListGenreCollection, and two helpers only used by the first) after grepping all of src/ to verify zero remaining callers for each — the file dropped from 445 to 267 lines. Added @@index([createdAt]) to Review, since /reviews, /feed, and /titles/[id] all sort by it and this was the exact shape of gap (Entries 58-59) that already bit Title at scale, cheap to close now rather than wait. Added scripts/db-push-safe.ts, wired to `npm run db:push`: derives the session-pooler URL and runs `prisma db push` against it, then automatically runs both scripts/add-search-index.ts and scripts/add-sort-indexes.ts — the fix Entry 58's own writeup called out as still missing ('nothing stops a future db push from silently dropping the indexes except a human remembering').</w:t>
+      </w:r>
+    </w:p>
+    <w:p>
+      <w:pPr>
+        <w:pStyle w:val="Heading2"/>
+      </w:pPr>
+      <w:r>
+        <w:t>Why this decision was made</w:t>
+      </w:r>
+    </w:p>
+    <w:p>
+      <w:r>
+        <w:t>Every deletion was verified rather than assumed: grepped for zero external callers before removing anything from anilist.ts, and reasoned through why null-anilist-linked-metadata.ts was actively dangerous (not just unused) before deleting it outright rather than just flagging it. The db:push wrapper directly closes a gap this project's own prior journal entry had already identified as a real, unaddressed risk — the audit surfaced it as still open, and fixing it now (a fresh script, immediately dogfooded to apply the Review.createdAt index itself) turns a 'remember to do this' process risk into a structural one that can't be forgotten.</w:t>
       </w:r>
     </w:p>
     <w:p/>

</xml_diff>

<commit_message>
Journal: log Entry 64 — first test suite (Vitest + business logic unit tests)
Co-Authored-By: Claude Sonnet 5 <noreply@anthropic.com>
</commit_message>
<xml_diff>
--- a/Projectinformation/Development_Journal.docx
+++ b/Projectinformation/Development_Journal.docx
@@ -11547,6 +11547,220 @@
     <w:p>
       <w:r>
         <w:t>Every deletion was verified rather than assumed: grepped for zero external callers before removing anything from anilist.ts, and reasoned through why null-anilist-linked-metadata.ts was actively dangerous (not just unused) before deleting it outright rather than just flagging it. The db:push wrapper directly closes a gap this project's own prior journal entry had already identified as a real, unaddressed risk — the audit surfaced it as still open, and fixing it now (a fresh script, immediately dogfooded to apply the Review.createdAt index itself) turns a 'remember to do this' process risk into a structural one that can't be forgotten.</w:t>
+      </w:r>
+    </w:p>
+    <w:p/>
+    <w:p>
+      <w:pPr>
+        <w:pStyle w:val="Heading1"/>
+        <w:spacing w:before="360"/>
+      </w:pPr>
+      <w:r>
+        <w:t>Entry 64: First Test Suite: Vitest + Unit Tests for Core Business Logic</w:t>
+      </w:r>
+    </w:p>
+    <w:p>
+      <w:pPr>
+        <w:spacing w:after="80"/>
+      </w:pPr>
+      <w:r>
+        <w:rPr>
+          <w:rStyle w:val="FieldLabel"/>
+        </w:rPr>
+        <w:t xml:space="preserve">Date: </w:t>
+      </w:r>
+      <w:r>
+        <w:t>2026-08-25</w:t>
+      </w:r>
+    </w:p>
+    <w:p>
+      <w:pPr>
+        <w:spacing w:after="80"/>
+      </w:pPr>
+      <w:r>
+        <w:rPr>
+          <w:rStyle w:val="FieldLabel"/>
+        </w:rPr>
+        <w:t xml:space="preserve">Type: </w:t>
+      </w:r>
+      <w:r>
+        <w:t>Decision</w:t>
+      </w:r>
+    </w:p>
+    <w:p>
+      <w:pPr>
+        <w:spacing w:after="80"/>
+      </w:pPr>
+      <w:r>
+        <w:rPr>
+          <w:rStyle w:val="FieldLabel"/>
+        </w:rPr>
+        <w:t xml:space="preserve">Status: </w:t>
+      </w:r>
+      <w:r>
+        <w:rPr>
+          <w:b/>
+          <w:color w:val="2E7D32"/>
+        </w:rPr>
+        <w:t>Resolved</w:t>
+      </w:r>
+    </w:p>
+    <w:p>
+      <w:pPr>
+        <w:spacing w:after="80"/>
+      </w:pPr>
+      <w:r>
+        <w:rPr>
+          <w:rStyle w:val="FieldLabel"/>
+        </w:rPr>
+        <w:t xml:space="preserve">Relates To: </w:t>
+      </w:r>
+      <w:r>
+        <w:t>Follows directly from Entry 63's cleanup pass and the code-quality assessment before it — asked 'does our code follow clean code and clean architecture,' which surfaced zero automated tests anywhere in the project as the one real gap, then asked to scope and build a test suite for the business-logic-heavy pieces.</w:t>
+      </w:r>
+    </w:p>
+    <w:p>
+      <w:pPr>
+        <w:pStyle w:val="Heading2"/>
+      </w:pPr>
+      <w:r>
+        <w:t>What this step was about</w:t>
+      </w:r>
+    </w:p>
+    <w:p>
+      <w:r>
+        <w:t>Added Vitest and the project's first automated tests: 35 tests across 6 files covering the seal-probation streak state machine, the reputation-score formula, the community-score rollup, rate-limit threshold checking, review-approval routing, and the first-review gate's branching logic. None of this logic was written as pure functions before — every candidate queried Prisma and computed/wrote its result in the same function body, and src/lib/prisma.ts constructs a real database adapter at import time, so nothing was unit-testable without either a live database connection or mocking. Extracted the actual calculations into small, named, exported pure functions with the existing async DB-coupled callers delegating to them, unchanged in signature and behavior.</w:t>
+      </w:r>
+    </w:p>
+    <w:p>
+      <w:r>
+        <w:t>A prior research agent surveyed every candidate business-logic module (seal probation, the four precomputed-aggregate recompute functions, rate limiting, vote casting) before any code was written, to find what was actually pure vs. DB-coupled and where non-injectable Date.now()/new Date() calls would block deterministic testing. That survey directly shaped the plan: extract-then-test the pure calculations, mock only where the thing worth protecting is branching logic rather than a separable formula (checkReviewGate), and don't attempt Server Action tests or a real test database in this first pass.</w:t>
+      </w:r>
+    </w:p>
+    <w:p>
+      <w:pPr>
+        <w:pStyle w:val="Heading2"/>
+      </w:pPr>
+      <w:r>
+        <w:t>Options considered</w:t>
+      </w:r>
+    </w:p>
+    <w:tbl>
+      <w:tblPr>
+        <w:tblStyle w:val="LightGrid-Accent1"/>
+        <w:tblW w:type="auto" w:w="0"/>
+        <w:tblLayout w:type="autofit"/>
+        <w:tblLook w:firstColumn="1" w:firstRow="1" w:lastColumn="0" w:lastRow="0" w:noHBand="0" w:noVBand="1" w:val="04A0"/>
+      </w:tblPr>
+      <w:tblGrid>
+        <w:gridCol w:w="4680"/>
+        <w:gridCol w:w="4680"/>
+      </w:tblGrid>
+      <w:tr>
+        <w:tc>
+          <w:tcPr>
+            <w:tcW w:type="dxa" w:w="4680"/>
+          </w:tcPr>
+          <w:p>
+            <w:r>
+              <w:rPr>
+                <w:b/>
+              </w:rPr>
+              <w:t>Option Considered</w:t>
+            </w:r>
+          </w:p>
+        </w:tc>
+        <w:tc>
+          <w:tcPr>
+            <w:tcW w:type="dxa" w:w="4680"/>
+          </w:tcPr>
+          <w:p>
+            <w:r>
+              <w:rPr>
+                <w:b/>
+              </w:rPr>
+              <w:t>Description</w:t>
+            </w:r>
+          </w:p>
+        </w:tc>
+      </w:tr>
+      <w:tr>
+        <w:tc>
+          <w:tcPr>
+            <w:tcW w:type="dxa" w:w="4680"/>
+          </w:tcPr>
+          <w:p>
+            <w:r>
+              <w:t>Vitest — chosen</w:t>
+            </w:r>
+          </w:p>
+        </w:tc>
+        <w:tc>
+          <w:tcPr>
+            <w:tcW w:type="dxa" w:w="4680"/>
+          </w:tcPr>
+          <w:p>
+            <w:r>
+              <w:t>Native ESM (matches this project's esnext module target), no Babel/ts-jest transform step, built-in vi.mock/vi.hoisted/fake-timers, native tsconfig-paths resolution via resolve.tsconfigPaths.</w:t>
+            </w:r>
+          </w:p>
+        </w:tc>
+      </w:tr>
+      <w:tr>
+        <w:tc>
+          <w:tcPr>
+            <w:tcW w:type="dxa" w:w="4680"/>
+          </w:tcPr>
+          <w:p>
+            <w:r>
+              <w:t>Jest</w:t>
+            </w:r>
+          </w:p>
+        </w:tc>
+        <w:tc>
+          <w:tcPr>
+            <w:tcW w:type="dxa" w:w="4680"/>
+          </w:tcPr>
+          <w:p>
+            <w:r>
+              <w:t>The more established alternative, but needs a transform step for TS/ESM and doesn't resolve this project's @/* path alias without extra moduleNameMapper config; not chosen given Vitest fits this stack with less setup.</w:t>
+            </w:r>
+          </w:p>
+        </w:tc>
+      </w:tr>
+    </w:tbl>
+    <w:p>
+      <w:pPr>
+        <w:spacing w:after="120"/>
+      </w:pPr>
+    </w:p>
+    <w:p>
+      <w:pPr>
+        <w:pStyle w:val="Heading2"/>
+      </w:pPr>
+      <w:r>
+        <w:t>Decision made</w:t>
+      </w:r>
+    </w:p>
+    <w:p>
+      <w:r>
+        <w:t>seal-probation.ts gained computeNextStreakState(currentStreakDays, netScore, now) — the extend/convert-at-30-days/reset-on-dip rules extracted from runSealProbationCheck's loop body, with an injectable clock instead of the two inline new Date() calls. user-reputation.ts gained computeReputationScore({reviewCount, certifiedBangerCount, netVotesReceived, votesCastByDay}) — the point-weighting formula including the daily-vote-engagement cap. title-aggregates.ts gained computeCommunityScore(avgCategoryScores) — the per-category-average rollup. rate-limit.ts's hourAgo() now takes an optional now param (defaults to new Date(), every caller unchanged); overLimit was already pure and just needed exporting. src/lib/review-approval.ts is a new file holding computeApprovalStatus, moved out of src/lib/actions/reviews.ts rather than exported in place — discovered during implementation that every export from a "use server" file must be an async Server Function, which a plain synchronous pure function can't be. checkReviewGate itself was left as-is (its branching across the first-review/email-verification/account-age checks is the thing worth protecting, not a separable calculation) and is tested instead by mocking @/lib/prisma, @/lib/auth, and @/lib/settings via vi.mock, using vi.hoisted() for the mock functions since vi.mock factories are hoisted above plain const declarations too.</w:t>
+        <w:br/>
+        <w:br/>
+        <w:t>Deliberately out of scope: Server Action tests (voteOnReview, submitReview, grantSeal — need requireUser/cookies() request context plus multi-call transaction mocking, a bigger lift for less isolated value) and any real test database (this project has never had a second database; standing one up for integration tests is an ongoing infrastructure commitment nobody asked for). Real-query correctness continues to be covered by this project's existing manual-verification discipline (EXPLAIN ANALYZE, live curl checks against production) rather than duplicated in the test suite.</w:t>
+      </w:r>
+    </w:p>
+    <w:p>
+      <w:pPr>
+        <w:pStyle w:val="Heading2"/>
+      </w:pPr>
+      <w:r>
+        <w:t>Why this decision was made</w:t>
+      </w:r>
+    </w:p>
+    <w:p>
+      <w:r>
+        <w:t>Scoped to unit tests over integration tests specifically because the stated goal was regression protection for business rules, not full-stack coverage — extracting pure functions achieves that with zero new infrastructure and fast, deterministic tests, which is the right-sized answer to what was actually asked. Every extraction was verified behavior-preserving by reasoning through the exact per-branch data shape the original inline code produced (particularly seal-probation's three update branches, which write different field subsets) before editing, then confirmed via the project's full existing verification bar (typecheck, lint, build) plus the new test run itself.</w:t>
       </w:r>
     </w:p>
     <w:p/>

</xml_diff>

<commit_message>
Journal: log Entry 65 — Server Action tests for votes and reviews
Co-Authored-By: Claude Sonnet 5 <noreply@anthropic.com>
</commit_message>
<xml_diff>
--- a/Projectinformation/Development_Journal.docx
+++ b/Projectinformation/Development_Journal.docx
@@ -11761,6 +11761,120 @@
     <w:p>
       <w:r>
         <w:t>Scoped to unit tests over integration tests specifically because the stated goal was regression protection for business rules, not full-stack coverage — extracting pure functions achieves that with zero new infrastructure and fast, deterministic tests, which is the right-sized answer to what was actually asked. Every extraction was verified behavior-preserving by reasoning through the exact per-branch data shape the original inline code produced (particularly seal-probation's three update branches, which write different field subsets) before editing, then confirmed via the project's full existing verification bar (typecheck, lint, build) plus the new test run itself.</w:t>
+      </w:r>
+    </w:p>
+    <w:p/>
+    <w:p>
+      <w:pPr>
+        <w:pStyle w:val="Heading1"/>
+        <w:spacing w:before="360"/>
+      </w:pPr>
+      <w:r>
+        <w:t>Entry 65: Server Action Tests: voteOnReview, submitReview, submitReviewForAniListTitle</w:t>
+      </w:r>
+    </w:p>
+    <w:p>
+      <w:pPr>
+        <w:spacing w:after="80"/>
+      </w:pPr>
+      <w:r>
+        <w:rPr>
+          <w:rStyle w:val="FieldLabel"/>
+        </w:rPr>
+        <w:t xml:space="preserve">Date: </w:t>
+      </w:r>
+      <w:r>
+        <w:t>2026-08-25</w:t>
+      </w:r>
+    </w:p>
+    <w:p>
+      <w:pPr>
+        <w:spacing w:after="80"/>
+      </w:pPr>
+      <w:r>
+        <w:rPr>
+          <w:rStyle w:val="FieldLabel"/>
+        </w:rPr>
+        <w:t xml:space="preserve">Type: </w:t>
+      </w:r>
+      <w:r>
+        <w:t>Decision</w:t>
+      </w:r>
+    </w:p>
+    <w:p>
+      <w:pPr>
+        <w:spacing w:after="80"/>
+      </w:pPr>
+      <w:r>
+        <w:rPr>
+          <w:rStyle w:val="FieldLabel"/>
+        </w:rPr>
+        <w:t xml:space="preserve">Status: </w:t>
+      </w:r>
+      <w:r>
+        <w:rPr>
+          <w:b/>
+          <w:color w:val="2E7D32"/>
+        </w:rPr>
+        <w:t>Resolved</w:t>
+      </w:r>
+    </w:p>
+    <w:p>
+      <w:pPr>
+        <w:spacing w:after="80"/>
+      </w:pPr>
+      <w:r>
+        <w:rPr>
+          <w:rStyle w:val="FieldLabel"/>
+        </w:rPr>
+        <w:t xml:space="preserve">Relates To: </w:t>
+      </w:r>
+      <w:r>
+        <w:t>Direct follow-up to Entry 64, which explicitly scoped Server Action tests out of the first pass as a bigger lift than the pure-function extractions done there.</w:t>
+      </w:r>
+    </w:p>
+    <w:p>
+      <w:pPr>
+        <w:pStyle w:val="Heading2"/>
+      </w:pPr>
+      <w:r>
+        <w:t>What this step was about</w:t>
+      </w:r>
+    </w:p>
+    <w:p>
+      <w:r>
+        <w:t>Added 26 tests (61 total with Entry 64's 35) covering the vote-casting and review-submission Server Actions directly, mocking their full dependency graph (Prisma including $transaction, requireUser, the review gate, rate limiting, the aggregate-recompute functions, next/cache's revalidatePath, next/navigation's redirect) rather than extracting more pure functions — the thing worth protecting in these three functions is branching logic across many collaborators, not an isolable calculation.</w:t>
+      </w:r>
+    </w:p>
+    <w:p>
+      <w:r>
+        <w:t>voteOnReview has a three-way branch (delete an existing same-value vote / update a different-value vote / create a new one, the last gated by a rate-limit check the other two skip) plus guards for a missing/unpublished/self-authored review. submitReview and its shared private helper createOrUpdateReview validate title existence, category configuration, body length, and per-category score ranges before writing inside a Prisma transaction, with a subtle rule around approval-status handling on edit (preserved as-is unless the prior review was REJECTED). submitReviewForAniListTitle shares that same validation/write path but always rate-limits (no new-vs-edit conditional, since the title didn't exist a moment ago) and redirects on success instead of just returning.</w:t>
+      </w:r>
+    </w:p>
+    <w:p>
+      <w:pPr>
+        <w:pStyle w:val="Heading2"/>
+      </w:pPr>
+      <w:r>
+        <w:t>Decision made</w:t>
+      </w:r>
+    </w:p>
+    <w:p>
+      <w:r>
+        <w:t>src/lib/actions/votes.test.ts and src/lib/actions/reviews.test.ts mock every collaborator module via vi.mock + vi.hoisted (the pattern established in Entry 64's review-gate.test.ts), including a $transaction mock that invokes its callback with a mock transaction client exposing the same review/reviewCategoryScore methods the real code calls. Test cases were chosen to match the actual branches in the source rather than generic CRUD coverage: both vote-rate-limit paths (blocked vs. allowed) but only for a brand-new vote, not a switch/undo; every createOrUpdateReview validation error message; the create-vs-update branch and its overallScore averaging; the REJECTED-vs-any-other-status approval-routing rule; and submitReviewForAniListTitle's three distinct short-circuits (gate, rate limit, import failure) plus its redirect-only-on-full-success path.</w:t>
+      </w:r>
+    </w:p>
+    <w:p>
+      <w:pPr>
+        <w:pStyle w:val="Heading2"/>
+      </w:pPr>
+      <w:r>
+        <w:t>Why this decision was made</w:t>
+      </w:r>
+    </w:p>
+    <w:p>
+      <w:r>
+        <w:t>Verified the tests actually catch regressions rather than passing vacuously: temporarily disabled the self-vote guard in the real votes.ts, confirmed the corresponding test failed with the expected assertion, then restored the original file (confirmed clean via `git diff`) before committing — the same 'don't just assume the fix worked, check' discipline this project has applied to every infrastructure and performance fix this session, applied here to test quality itself. Mocking the full dependency graph rather than trying to extract more pure functions was the right call because these three functions' actual value is in correctly sequencing and gating calls to many collaborators (rate limit, seal candidacy, reputation, aggregates) — that sequencing is exactly what a mock-based test exercises, and there was no natural pure sub-calculation left to pull out the way there was in Entry 64's targets.</w:t>
       </w:r>
     </w:p>
     <w:p/>

</xml_diff>

<commit_message>
Journal: log Entry 66 — design system & layout polish pass
Co-Authored-By: Claude Sonnet 5 <noreply@anthropic.com>
</commit_message>
<xml_diff>
--- a/Projectinformation/Development_Journal.docx
+++ b/Projectinformation/Development_Journal.docx
@@ -11875,6 +11875,129 @@
     <w:p>
       <w:r>
         <w:t>Verified the tests actually catch regressions rather than passing vacuously: temporarily disabled the self-vote guard in the real votes.ts, confirmed the corresponding test failed with the expected assertion, then restored the original file (confirmed clean via `git diff`) before committing — the same 'don't just assume the fix worked, check' discipline this project has applied to every infrastructure and performance fix this session, applied here to test quality itself. Mocking the full dependency graph rather than trying to extract more pure functions was the right call because these three functions' actual value is in correctly sequencing and gating calls to many collaborators (rate limit, seal candidacy, reputation, aggregates) — that sequencing is exactly what a mock-based test exercises, and there was no natural pure sub-calculation left to pull out the way there was in Entry 64's targets.</w:t>
+      </w:r>
+    </w:p>
+    <w:p/>
+    <w:p>
+      <w:pPr>
+        <w:pStyle w:val="Heading1"/>
+        <w:spacing w:before="360"/>
+      </w:pPr>
+      <w:r>
+        <w:t>Entry 66: Design System &amp; Layout Polish Pass</w:t>
+      </w:r>
+    </w:p>
+    <w:p>
+      <w:pPr>
+        <w:spacing w:after="80"/>
+      </w:pPr>
+      <w:r>
+        <w:rPr>
+          <w:rStyle w:val="FieldLabel"/>
+        </w:rPr>
+        <w:t xml:space="preserve">Date: </w:t>
+      </w:r>
+      <w:r>
+        <w:t>2026-08-25</w:t>
+      </w:r>
+    </w:p>
+    <w:p>
+      <w:pPr>
+        <w:spacing w:after="80"/>
+      </w:pPr>
+      <w:r>
+        <w:rPr>
+          <w:rStyle w:val="FieldLabel"/>
+        </w:rPr>
+        <w:t xml:space="preserve">Type: </w:t>
+      </w:r>
+      <w:r>
+        <w:t>Decision</w:t>
+      </w:r>
+    </w:p>
+    <w:p>
+      <w:pPr>
+        <w:spacing w:after="80"/>
+      </w:pPr>
+      <w:r>
+        <w:rPr>
+          <w:rStyle w:val="FieldLabel"/>
+        </w:rPr>
+        <w:t xml:space="preserve">Status: </w:t>
+      </w:r>
+      <w:r>
+        <w:rPr>
+          <w:b/>
+          <w:color w:val="2E7D32"/>
+        </w:rPr>
+        <w:t>Resolved</w:t>
+      </w:r>
+    </w:p>
+    <w:p>
+      <w:pPr>
+        <w:spacing w:after="80"/>
+      </w:pPr>
+      <w:r>
+        <w:rPr>
+          <w:rStyle w:val="FieldLabel"/>
+        </w:rPr>
+        <w:t xml:space="preserve">Relates To: </w:t>
+      </w:r>
+      <w:r>
+        <w:t>Follows the Entry 58-65 performance/testing/cleanup work — asked directly to improve the overall website design and layout so it 'feels good to use and also looks good.'</w:t>
+      </w:r>
+    </w:p>
+    <w:p>
+      <w:pPr>
+        <w:pStyle w:val="Heading2"/>
+      </w:pPr>
+      <w:r>
+        <w:t>What this step was about</w:t>
+      </w:r>
+    </w:p>
+    <w:p>
+      <w:r>
+        <w:t>A background research agent surveyed every shared style file, every non-trivial component, and a representative sample of pages not yet inspected this session, before any code was written. The app already had a coherent dark-first amber-accent theme (Tailwind v4 CSS-first config) and a shared class-constants file (src/lib/ui-classes.ts) — the problems were inconsistent application of that system, not wrong taste: 3 of 10 ui-classes.ts exports were dead code (nothing imported them), which is exactly why the things they should have styled got hand-rolled instead and drifted; zero icon library existed (one recurring emoji plus two Unicode vote-arrow glyphs); zero loading states anywhere; no footer; sparse focus-visible styling. Treated as a consistency-and-completion pass on the existing design language, not a rebrand.</w:t>
+      </w:r>
+    </w:p>
+    <w:p>
+      <w:r>
+        <w:t>Planned via EnterPlanMode given the genuinely broad, multi-file, subjective nature of the request. The survey's concrete findings (exact drift examples, dead constants, missing icon system) directly shaped the plan's scope boundary: fix what's inconsistent and fill real gaps, explicitly not a new color palette/typography, an admin dashboard rewrite, a theme-toggle UI, or new animation/motion language beyond what already existed.</w:t>
+      </w:r>
+    </w:p>
+    <w:p>
+      <w:pPr>
+        <w:pStyle w:val="Heading2"/>
+      </w:pPr>
+      <w:r>
+        <w:t>Decision made</w:t>
+      </w:r>
+    </w:p>
+    <w:p>
+      <w:r>
+        <w:t>globals.css gained semantic color tokens (--success/--warning/--danger, light+dark) for the emerald/amber/red shades already used ad hoc everywhere, plus a documented radius convention. ui-classes.ts's three dead constants were fleshed out instead of left to rot: BUTTON_DANGER completed to match BUTTON_PRIMARY's structure, CARD_HOVER became the actual shared hover-lift recipe (previously retyped independently in title-card-grid.tsx, latest-reviews.tsx, and feed/page.tsx — now all three use it), PILL_BADGE made ready for use. Every button variant and LINK gained a focus-visible ring. Three named container-width constants (CONTAINER_NARROW/CONTAINER/CONTAINER_WIDE) formalize widths already chosen ad hoc per page, without forcing one width everywhere.</w:t>
+        <w:br/>
+        <w:br/>
+        <w:t>Closed concrete drift: settings-form.tsx (the worst offender — a hand-cloned, buggy BUTTON_PRIMARY clone and zero focus rings on any input) now uses the real shared classes. library-widget.tsx's select and report-button.tsx's textarea gained focus rings; report-button's submit action became a proper small pill button instead of underlined text. admin/layout.tsx's nav was split into a new client component (admin-nav.tsx, since active-route highlighting needs usePathname(), a client-only hook, while the layout itself must stay a Server Component for its requireAdmin() check) and gained real active-route highlighting, which didn't exist before.</w:t>
+        <w:br/>
+        <w:br/>
+        <w:t>src/lib/score-color.ts was extracted from title-card-grid.tsx's local scoreColor() so the score-tier color mapping isn't locked to one component. Added lucide-react (new dependency) and applied it narrowly: vote-buttons.tsx's Unicode /▲▼ replaced with ArrowBigUp/ArrowBigDown icons; a search icon added to every search input (live-search-input.tsx plus the homepage hero, each using a purpose-built single class string rather than composing a wider left-padding onto the caller-supplied className — Tailwind resolves conflicting utilities like px-3 vs pl-9 by generated-stylesheet order, not by className string concatenation order, which was flagged as a real fragility risk and avoided throughout this pass, including in settings-form.tsx's narrow number inputs via a width-constrained wrapper div instead of composing a conflicting w-32 onto INPUT's own w-full). One new shared EmptyState component (icon + message) replaced three independently-styled empty-state paragraphs on /seals and /feed, and filled a real gap on the profile page, which previously rendered nothing at all when a user's library was empty.</w:t>
+        <w:br/>
+        <w:br/>
+        <w:t>Added loading.tsx skeletons (CARD shape + animate-pulse) to /titles, /titles/[id], and /reviews specifically — the three heaviest, most-visited routes — not site-wide, since a root-level loading.tsx would also cover already-fast admin/simple pages where it adds a jarring flash for little benefit. Added src/components/footer.tsx (brand + the same primary nav Header already has, nothing invented) wired into the root layout, which had none before.</w:t>
+      </w:r>
+    </w:p>
+    <w:p>
+      <w:pPr>
+        <w:pStyle w:val="Heading2"/>
+      </w:pPr>
+      <w:r>
+        <w:t>Why this decision was made</w:t>
+      </w:r>
+    </w:p>
+    <w:p>
+      <w:r>
+        <w:t>No browser/screenshot tool is available in this environment, which was stated upfront as a real verification limit rather than glossed over. Verification was structural: npm run build/lint/typecheck/test all clean, every touched route curl-checked for its expected status code, and grepped for new markers reachable without an authenticated session (footer markup, search icon SVGs present in the rendered HTML). The vote-icon rendering path and the admin-nav active-highlighting are both gated behind an authenticated session and couldn't be curl-verified directly — build success confirms they compile and type-check correctly, but the actual visual/interactive result needs a human looking at the running site, which was communicated explicitly rather than claimed as verified when it wasn't. The Tailwind utility-conflict risk (composing a width/padding override via className string concatenation, e.g. w-32 onto INPUT's w-full) was identified and deliberately avoided everywhere it came up in this pass, using either a width-constrained wrapper div or a single deliberately-authored class string instead of runtime string concatenation of conflicting utilities.</w:t>
       </w:r>
     </w:p>
     <w:p/>

</xml_diff>

<commit_message>
Journal: log Entry 67 — visual identity pass
Co-Authored-By: Claude Sonnet 5 <noreply@anthropic.com>
</commit_message>
<xml_diff>
--- a/Projectinformation/Development_Journal.docx
+++ b/Projectinformation/Development_Journal.docx
@@ -11998,6 +11998,120 @@
     <w:p>
       <w:r>
         <w:t>No browser/screenshot tool is available in this environment, which was stated upfront as a real verification limit rather than glossed over. Verification was structural: npm run build/lint/typecheck/test all clean, every touched route curl-checked for its expected status code, and grepped for new markers reachable without an authenticated session (footer markup, search icon SVGs present in the rendered HTML). The vote-icon rendering path and the admin-nav active-highlighting are both gated behind an authenticated session and couldn't be curl-verified directly — build success confirms they compile and type-check correctly, but the actual visual/interactive result needs a human looking at the running site, which was communicated explicitly rather than claimed as verified when it wasn't. The Tailwind utility-conflict risk (composing a width/padding override via className string concatenation, e.g. w-32 onto INPUT's w-full) was identified and deliberately avoided everywhere it came up in this pass, using either a width-constrained wrapper div or a single deliberately-authored class string instead of runtime string concatenation of conflicting utilities.</w:t>
+      </w:r>
+    </w:p>
+    <w:p/>
+    <w:p>
+      <w:pPr>
+        <w:pStyle w:val="Heading1"/>
+        <w:spacing w:before="360"/>
+      </w:pPr>
+      <w:r>
+        <w:t>Entry 67: Visual Identity Pass: Display Type, Glow Treatments, Warm Shadows</w:t>
+      </w:r>
+    </w:p>
+    <w:p>
+      <w:pPr>
+        <w:spacing w:after="80"/>
+      </w:pPr>
+      <w:r>
+        <w:rPr>
+          <w:rStyle w:val="FieldLabel"/>
+        </w:rPr>
+        <w:t xml:space="preserve">Date: </w:t>
+      </w:r>
+      <w:r>
+        <w:t>2026-08-25</w:t>
+      </w:r>
+    </w:p>
+    <w:p>
+      <w:pPr>
+        <w:spacing w:after="80"/>
+      </w:pPr>
+      <w:r>
+        <w:rPr>
+          <w:rStyle w:val="FieldLabel"/>
+        </w:rPr>
+        <w:t xml:space="preserve">Type: </w:t>
+      </w:r>
+      <w:r>
+        <w:t>Decision</w:t>
+      </w:r>
+    </w:p>
+    <w:p>
+      <w:pPr>
+        <w:spacing w:after="80"/>
+      </w:pPr>
+      <w:r>
+        <w:rPr>
+          <w:rStyle w:val="FieldLabel"/>
+        </w:rPr>
+        <w:t xml:space="preserve">Status: </w:t>
+      </w:r>
+      <w:r>
+        <w:rPr>
+          <w:b/>
+          <w:color w:val="2E7D32"/>
+        </w:rPr>
+        <w:t>Resolved</w:t>
+      </w:r>
+    </w:p>
+    <w:p>
+      <w:pPr>
+        <w:spacing w:after="80"/>
+      </w:pPr>
+      <w:r>
+        <w:rPr>
+          <w:rStyle w:val="FieldLabel"/>
+        </w:rPr>
+        <w:t xml:space="preserve">Relates To: </w:t>
+      </w:r>
+      <w:r>
+        <w:t>Direct follow-up to Entry 66 (the design-system consistency pass) — the user shared an actual screenshot of the live homepage for the first time this session and gave blunt, specific feedback.</w:t>
+      </w:r>
+    </w:p>
+    <w:p>
+      <w:pPr>
+        <w:pStyle w:val="Heading2"/>
+      </w:pPr>
+      <w:r>
+        <w:t>What this step was about</w:t>
+      </w:r>
+    </w:p>
+    <w:p>
+      <w:r>
+        <w:t>Entry 66 fixed inconsistency (drifted components, missing focus states, no icons) but left the app's actual visual character untouched — every element was still the same flat bordered rectangle. Seeing a real screenshot for the first time this session confirmed it: search bar, review cards, score badges, and the Certified Bangers section (the app's namesake differentiator) all looked identical to each other, with no hierarchy or personality. The user explicitly wanted the dark background + amber accent kept, with the design made 'unique and very good looking' rather than a palette change.</w:t>
+      </w:r>
+    </w:p>
+    <w:p>
+      <w:r>
+        <w:t>This session had been verifying every prior visual change structurally (build/lint/typecheck, curl status codes, grepped HTML markers) since no browser/screenshot tool was available — that caught real bugs but couldn't catch 'this looks generic,' which only became visible once the user supplied their own screenshot. Proceeded with direct implementation rather than another full EnterPlanMode cycle, matching the fast screenshot-critique-redo loop the user had clearly established rather than slowing it down with a written plan for what was fundamentally a creative brief with one clear constraint (keep dark/gold).</w:t>
+      </w:r>
+    </w:p>
+    <w:p>
+      <w:pPr>
+        <w:pStyle w:val="Heading2"/>
+      </w:pPr>
+      <w:r>
+        <w:t>Decision made</w:t>
+      </w:r>
+    </w:p>
+    <w:p>
+      <w:r>
+        <w:t>Added Space Grotesk (next/font/google) as a second, display-only typeface for headlines/section headers, with body text staying on the existing Geist Sans — a deliberate two-tier type system rather than a fresh general reskin. Applied to every H1 across the app (roughly two dozen files) via a scoped find/replace on the two exact base class strings shared by all of them, confirmed via grep to appear nowhere else before running it. New src/components/section-heading.tsx (a small accent-colored 'kicker' bar + the display face) replaced four independently-typed homepage section headers. The Certified Bangers section — the brief's own called-out differentiator — got a real showcase treatment (a gold-tinted gradient band background) instead of sitting in the same generic section loop as Most Popular/Highest Rated. Score badges (score-color.ts, title-card-grid.tsx) moved from a flat colored rectangle to a glowing ring badge (tier-colored ring + shadow); the Certified Banger corner chip got the matching accent-colored ring/glow treatment; cover art gained a bottom gradient for depth and badge legibility. CARD_HOVER (ui-classes.ts) now casts a warm amber-tinted glow instead of a generic black drop shadow, and BUTTON_PRIMARY gained a subtle gradient fill plus a hover brightness/shadow-growth transition instead of a flat color swap. The hero gained a bigger/bolder display-face H1, a soft accent-colored radial glow behind the character illustration, and a real drop shadow on the artwork itself.</w:t>
+      </w:r>
+    </w:p>
+    <w:p>
+      <w:pPr>
+        <w:pStyle w:val="Heading2"/>
+      </w:pPr>
+      <w:r>
+        <w:t>Why this decision was made</w:t>
+      </w:r>
+    </w:p>
+    <w:p>
+      <w:r>
+        <w:t>The find/replace safety check (grepping for the exact base class strings outside h1 tags before running a repo-wide sweep) followed the same 'verify before trusting a broad change' discipline used throughout this session for infrastructure work, applied here to a bulk styling edit instead. Every change was verified structurally exactly as in Entry 66 (clean build/lint/typecheck/test, every route curl-checked, new markers grepped from rendered HTML) with the same explicit caveat repeated to the user: structural verification confirms nothing broke, not that the redesign actually looks good — that judgment call was left to the user's own eyes on a fresh screenshot, consistent with treating the screenshot-feedback loop as the real verification mechanism for this kind of subjective, visual work.</w:t>
       </w:r>
     </w:p>
     <w:p/>

</xml_diff>

<commit_message>
Journal: log Entry 68 — smaller cards + hover popover
Co-Authored-By: Claude Sonnet 5 <noreply@anthropic.com>
</commit_message>
<xml_diff>
--- a/Projectinformation/Development_Journal.docx
+++ b/Projectinformation/Development_Journal.docx
@@ -12112,6 +12112,120 @@
     <w:p>
       <w:r>
         <w:t>The find/replace safety check (grepping for the exact base class strings outside h1 tags before running a repo-wide sweep) followed the same 'verify before trusting a broad change' discipline used throughout this session for infrastructure work, applied here to a bulk styling edit instead. Every change was verified structurally exactly as in Entry 66 (clean build/lint/typecheck/test, every route curl-checked, new markers grepped from rendered HTML) with the same explicit caveat repeated to the user: structural verification confirms nothing broke, not that the redesign actually looks good — that judgment call was left to the user's own eyes on a fresh screenshot, consistent with treating the screenshot-feedback loop as the real verification mechanism for this kind of subjective, visual work.</w:t>
+      </w:r>
+    </w:p>
+    <w:p/>
+    <w:p>
+      <w:pPr>
+        <w:pStyle w:val="Heading1"/>
+        <w:spacing w:before="360"/>
+      </w:pPr>
+      <w:r>
+        <w:t>Entry 68: Smaller Title Cards + AniList-Style Hover Popover</w:t>
+      </w:r>
+    </w:p>
+    <w:p>
+      <w:pPr>
+        <w:spacing w:after="80"/>
+      </w:pPr>
+      <w:r>
+        <w:rPr>
+          <w:rStyle w:val="FieldLabel"/>
+        </w:rPr>
+        <w:t xml:space="preserve">Date: </w:t>
+      </w:r>
+      <w:r>
+        <w:t>2026-08-25</w:t>
+      </w:r>
+    </w:p>
+    <w:p>
+      <w:pPr>
+        <w:spacing w:after="80"/>
+      </w:pPr>
+      <w:r>
+        <w:rPr>
+          <w:rStyle w:val="FieldLabel"/>
+        </w:rPr>
+        <w:t xml:space="preserve">Type: </w:t>
+      </w:r>
+      <w:r>
+        <w:t>Decision</w:t>
+      </w:r>
+    </w:p>
+    <w:p>
+      <w:pPr>
+        <w:spacing w:after="80"/>
+      </w:pPr>
+      <w:r>
+        <w:rPr>
+          <w:rStyle w:val="FieldLabel"/>
+        </w:rPr>
+        <w:t xml:space="preserve">Status: </w:t>
+      </w:r>
+      <w:r>
+        <w:rPr>
+          <w:b/>
+          <w:color w:val="2E7D32"/>
+        </w:rPr>
+        <w:t>Resolved</w:t>
+      </w:r>
+    </w:p>
+    <w:p>
+      <w:pPr>
+        <w:spacing w:after="80"/>
+      </w:pPr>
+      <w:r>
+        <w:rPr>
+          <w:rStyle w:val="FieldLabel"/>
+        </w:rPr>
+        <w:t xml:space="preserve">Relates To: </w:t>
+      </w:r>
+      <w:r>
+        <w:t>Direct follow-up to Entry 67, with two more reference screenshots — one of the live site showing oversized cover images, one of AniList itself showing the hover-popover pattern being asked for.</w:t>
+      </w:r>
+    </w:p>
+    <w:p>
+      <w:pPr>
+        <w:pStyle w:val="Heading2"/>
+      </w:pPr>
+      <w:r>
+        <w:t>What this step was about</w:t>
+      </w:r>
+    </w:p>
+    <w:p>
+      <w:r>
+        <w:t>TitleCardGrid's grid density went from grid-cols-2/3/4 to 3/4/5/6, shrinking every card at every breakpoint without changing the cover art's 2:3 aspect ratio. Added a hover popover matching AniList's own pattern: title, type/status/score, and up to 4 genre pills. Getting the popover to actually escape the card's rounded-corner clipping required a real structural fix caught mid-implementation — the first draft removed overflow-hidden from the whole card to let the popover escape, which also broke the card's own bottom-corner rounding on the text section; the fix splits the card into a plain positioning wrapper (the Link) containing a separate clipped inner wrapper (the actual card visuals) with the popover as a sibling of that inner wrapper instead of a descendant of it.</w:t>
+      </w:r>
+    </w:p>
+    <w:p>
+      <w:r>
+        <w:t>TitleCard's type gained optional status/genres fields specifically so this could ship without touching every caller — three of four callers (homepage, /titles, /seals) do a plain Prisma findMany() with no select, so Title's full row (which already includes both fields) flows through with zero code changes on their end; only profile/[username]/page.tsx had an explicit narrow select that needed widening to include them.</w:t>
+      </w:r>
+    </w:p>
+    <w:p>
+      <w:pPr>
+        <w:pStyle w:val="Heading2"/>
+      </w:pPr>
+      <w:r>
+        <w:t>Decision made</w:t>
+      </w:r>
+    </w:p>
+    <w:p>
+      <w:r>
+        <w:t>The popover is left-anchored (not centered under the card) so it only ever overflows to the right on hover — overlapping the next card in the row, the same trade-off AniList's own popover makes — rather than risking a centered wider-than-card panel clipping past the viewport's left or right edge for cards in the first/last grid column. hover:z-20 on the outer Link lifts the whole card (including its popover) above sibling cards' stacking order while hovered, since later-DOM-order siblings would otherwise render on top by default.</w:t>
+      </w:r>
+    </w:p>
+    <w:p>
+      <w:pPr>
+        <w:pStyle w:val="Heading2"/>
+      </w:pPr>
+      <w:r>
+        <w:t>Why this decision was made</w:t>
+      </w:r>
+    </w:p>
+    <w:p>
+      <w:r>
+        <w:t>The overflow-hidden/rounded-corner bug was caught by reasoning through the DOM structure before treating the first draft as done, not by visual inspection (still no browser tool available) — the same 'verify structurally, state what couldn't be checked' discipline as Entries 66-67. Genuinely could not visually confirm the popover renders correctly on an actual profile page, since no seeded test account has library entries to render a card there at all; treated as an acceptable verification gap given the identical TitleCardGrid component was already confirmed rendering correctly (with real genre data present in the output HTML) on the homepage, and the profile page's only change (a Prisma select widening) typechecked cleanly against the shared component's prop type.</w:t>
       </w:r>
     </w:p>
     <w:p/>

</xml_diff>

<commit_message>
Journal: log Entry 69 — hero "how it works" explainer
Co-Authored-By: Claude Sonnet 5 <noreply@anthropic.com>
</commit_message>
<xml_diff>
--- a/Projectinformation/Development_Journal.docx
+++ b/Projectinformation/Development_Journal.docx
@@ -12226,6 +12226,120 @@
     <w:p>
       <w:r>
         <w:t>The overflow-hidden/rounded-corner bug was caught by reasoning through the DOM structure before treating the first draft as done, not by visual inspection (still no browser tool available) — the same 'verify structurally, state what couldn't be checked' discipline as Entries 66-67. Genuinely could not visually confirm the popover renders correctly on an actual profile page, since no seeded test account has library entries to render a card there at all; treated as an acceptable verification gap given the identical TitleCardGrid component was already confirmed rendering correctly (with real genre data present in the output HTML) on the homepage, and the profile page's only change (a Prisma select widening) typechecked cleanly against the shared component's prop type.</w:t>
+      </w:r>
+    </w:p>
+    <w:p/>
+    <w:p>
+      <w:pPr>
+        <w:pStyle w:val="Heading1"/>
+        <w:spacing w:before="360"/>
+      </w:pPr>
+      <w:r>
+        <w:t>Entry 69: Hero "How It Works" Explainer — Corrected Against the Real Mechanic</w:t>
+      </w:r>
+    </w:p>
+    <w:p>
+      <w:pPr>
+        <w:spacing w:after="80"/>
+      </w:pPr>
+      <w:r>
+        <w:rPr>
+          <w:rStyle w:val="FieldLabel"/>
+        </w:rPr>
+        <w:t xml:space="preserve">Date: </w:t>
+      </w:r>
+      <w:r>
+        <w:t>2026-08-25</w:t>
+      </w:r>
+    </w:p>
+    <w:p>
+      <w:pPr>
+        <w:spacing w:after="80"/>
+      </w:pPr>
+      <w:r>
+        <w:rPr>
+          <w:rStyle w:val="FieldLabel"/>
+        </w:rPr>
+        <w:t xml:space="preserve">Type: </w:t>
+      </w:r>
+      <w:r>
+        <w:t>Decision</w:t>
+      </w:r>
+    </w:p>
+    <w:p>
+      <w:pPr>
+        <w:spacing w:after="80"/>
+      </w:pPr>
+      <w:r>
+        <w:rPr>
+          <w:rStyle w:val="FieldLabel"/>
+        </w:rPr>
+        <w:t xml:space="preserve">Status: </w:t>
+      </w:r>
+      <w:r>
+        <w:rPr>
+          <w:b/>
+          <w:color w:val="2E7D32"/>
+        </w:rPr>
+        <w:t>Resolved</w:t>
+      </w:r>
+    </w:p>
+    <w:p>
+      <w:pPr>
+        <w:spacing w:after="80"/>
+      </w:pPr>
+      <w:r>
+        <w:rPr>
+          <w:rStyle w:val="FieldLabel"/>
+        </w:rPr>
+        <w:t xml:space="preserve">Relates To: </w:t>
+      </w:r>
+      <w:r>
+        <w:t>Requested directly: an explanation of the site's core workflow (finish something great, write a review, community votes, title earns the Certified Banger seal with the reviewer's name attached) added to the homepage hero.</w:t>
+      </w:r>
+    </w:p>
+    <w:p>
+      <w:pPr>
+        <w:pStyle w:val="Heading2"/>
+      </w:pPr>
+      <w:r>
+        <w:t>What this step was about</w:t>
+      </w:r>
+    </w:p>
+    <w:p>
+      <w:r>
+        <w:t>Added a 3-step visual strip (write the review / the community votes / earn the seal) to the hero, replacing a small muted paragraph that repeated the same explanation less clearly and — it turned out — inaccurately. The requested wording described two mechanics that don't match the actual implementation: an '80% upvote ratio' gate, and 'there can only be one Certified Banger seal for a title.' Checked both against schema.prisma before writing any copy rather than transcribing the request verbatim.</w:t>
+      </w:r>
+    </w:p>
+    <w:p>
+      <w:r>
+        <w:t>PlatformSettings.sealQualityGateThreshold (default +20) is a net vote score — upvotes minus downvotes, admin-configurable — not a percentage/ratio; the '80%' framing was already stale, inaccurate copy on the site before this change touched it. SealAward attaches to individual reviews (not titles directly), and Title.certifiedBangerCount is a count, not a boolean — a title can accumulate the seal from multiple different users' reviews, each independently crossing the vote threshold, not just one canonical seal-holder.</w:t>
+      </w:r>
+    </w:p>
+    <w:p>
+      <w:pPr>
+        <w:pStyle w:val="Heading2"/>
+      </w:pPr>
+      <w:r>
+        <w:t>Decision made</w:t>
+      </w:r>
+    </w:p>
+    <w:p>
+      <w:r>
+        <w:t>Wrote copy that keeps the requested narrative's spirit (finish something great -&gt; write a review -&gt; community votes -&gt; seal earned, crediting the reviewer by name) while stating the two corrected facts explicitly: 'enough net upvotes' rather than a ratio, and 'a title can carry more than one, one per review that earns it' rather than implying a single seal. Presented as three icon+text cards (lucide's PenLine/ArrowBigUp/Award) in a row between the hero's intro text and the search form, rather than another paragraph — matches Entry 67's move away from dense text blocks toward small distinct visual units.</w:t>
+      </w:r>
+    </w:p>
+    <w:p>
+      <w:pPr>
+        <w:pStyle w:val="Heading2"/>
+      </w:pPr>
+      <w:r>
+        <w:t>Why this decision was made</w:t>
+      </w:r>
+    </w:p>
+    <w:p>
+      <w:r>
+        <w:t>Verifying user-supplied copy against the actual schema/business logic before publishing it as site content is the same 'verify, don't transcribe' discipline this project has applied to code changes all session, extended here to marketing copy — publishing inaccurate mechanics on the site itself would have been a real correctness problem, not just a style one, and would have made the existing stale '80% ratio' copy worse by restating a second inaccurate claim alongside it instead of an opportunity to fix both at once.</w:t>
       </w:r>
     </w:p>
     <w:p/>

</xml_diff>

<commit_message>
Journal: log Entry 70 — confirmed seal stays uncapped per title
Co-Authored-By: Claude Sonnet 5 <noreply@anthropic.com>
</commit_message>
<xml_diff>
--- a/Projectinformation/Development_Journal.docx
+++ b/Projectinformation/Development_Journal.docx
@@ -12340,6 +12340,217 @@
     <w:p>
       <w:r>
         <w:t>Verifying user-supplied copy against the actual schema/business logic before publishing it as site content is the same 'verify, don't transcribe' discipline this project has applied to code changes all session, extended here to marketing copy — publishing inaccurate mechanics on the site itself would have been a real correctness problem, not just a style one, and would have made the existing stale '80% ratio' copy worse by restating a second inaccurate claim alongside it instead of an opportunity to fix both at once.</w:t>
+      </w:r>
+    </w:p>
+    <w:p/>
+    <w:p>
+      <w:pPr>
+        <w:pStyle w:val="Heading1"/>
+        <w:spacing w:before="360"/>
+      </w:pPr>
+      <w:r>
+        <w:t>Entry 70: Confirmed: Certified Banger Seal Stays Uncapped Per Title</w:t>
+      </w:r>
+    </w:p>
+    <w:p>
+      <w:pPr>
+        <w:spacing w:after="80"/>
+      </w:pPr>
+      <w:r>
+        <w:rPr>
+          <w:rStyle w:val="FieldLabel"/>
+        </w:rPr>
+        <w:t xml:space="preserve">Date: </w:t>
+      </w:r>
+      <w:r>
+        <w:t>2026-08-25</w:t>
+      </w:r>
+    </w:p>
+    <w:p>
+      <w:pPr>
+        <w:spacing w:after="80"/>
+      </w:pPr>
+      <w:r>
+        <w:rPr>
+          <w:rStyle w:val="FieldLabel"/>
+        </w:rPr>
+        <w:t xml:space="preserve">Type: </w:t>
+      </w:r>
+      <w:r>
+        <w:t>Decision</w:t>
+      </w:r>
+    </w:p>
+    <w:p>
+      <w:pPr>
+        <w:spacing w:after="80"/>
+      </w:pPr>
+      <w:r>
+        <w:rPr>
+          <w:rStyle w:val="FieldLabel"/>
+        </w:rPr>
+        <w:t xml:space="preserve">Status: </w:t>
+      </w:r>
+      <w:r>
+        <w:rPr>
+          <w:b/>
+          <w:color w:val="2E7D32"/>
+        </w:rPr>
+        <w:t>Resolved</w:t>
+      </w:r>
+    </w:p>
+    <w:p>
+      <w:pPr>
+        <w:spacing w:after="80"/>
+      </w:pPr>
+      <w:r>
+        <w:rPr>
+          <w:rStyle w:val="FieldLabel"/>
+        </w:rPr>
+        <w:t xml:space="preserve">Relates To: </w:t>
+      </w:r>
+      <w:r>
+        <w:t>Direct follow-up to Entry 69 — the user flagged that the hero copy's 'a title can carry more than one' claim was wrong, stating their intent was one seal per title.</w:t>
+      </w:r>
+    </w:p>
+    <w:p>
+      <w:pPr>
+        <w:pStyle w:val="Heading2"/>
+      </w:pPr>
+      <w:r>
+        <w:t>What this step was about</w:t>
+      </w:r>
+    </w:p>
+    <w:p>
+      <w:r>
+        <w:t>Checked the actual granting logic before agreeing or changing anything: checkAutoSealCandidacy (src/lib/seal-probation.ts) has no title-level cap today — it only checks whether the specific review already holds the seal, not whether any other review of the same title does, so certifiedBangerCount can and does exceed 1 in practice. The user's stated intent (one seal per title) contradicted the shipped behavior, and they were genuinely unsure which was actually right for the product ('I am not so sure about how to handle this'), so this became a real product discussion rather than a quick copy fix.</w:t>
+      </w:r>
+    </w:p>
+    <w:p>
+      <w:r>
+        <w:t>The user's stated goal, in their own words: motivate people to write reviews for titles they consider genuinely great, and make a title easier to discover once enough people agree via upvotes. That goal was used as the deciding criterion between the two mechanisms rather than treating either as a default.</w:t>
+      </w:r>
+    </w:p>
+    <w:p>
+      <w:pPr>
+        <w:pStyle w:val="Heading2"/>
+      </w:pPr>
+      <w:r>
+        <w:t>Options considered</w:t>
+      </w:r>
+    </w:p>
+    <w:tbl>
+      <w:tblPr>
+        <w:tblStyle w:val="LightGrid-Accent1"/>
+        <w:tblW w:type="auto" w:w="0"/>
+        <w:tblLayout w:type="autofit"/>
+        <w:tblLook w:firstColumn="1" w:firstRow="1" w:lastColumn="0" w:lastRow="0" w:noHBand="0" w:noVBand="1" w:val="04A0"/>
+      </w:tblPr>
+      <w:tblGrid>
+        <w:gridCol w:w="4680"/>
+        <w:gridCol w:w="4680"/>
+      </w:tblGrid>
+      <w:tr>
+        <w:tc>
+          <w:tcPr>
+            <w:tcW w:type="dxa" w:w="4680"/>
+          </w:tcPr>
+          <w:p>
+            <w:r>
+              <w:rPr>
+                <w:b/>
+              </w:rPr>
+              <w:t>Option Considered</w:t>
+            </w:r>
+          </w:p>
+        </w:tc>
+        <w:tc>
+          <w:tcPr>
+            <w:tcW w:type="dxa" w:w="4680"/>
+          </w:tcPr>
+          <w:p>
+            <w:r>
+              <w:rPr>
+                <w:b/>
+              </w:rPr>
+              <w:t>Description</w:t>
+            </w:r>
+          </w:p>
+        </w:tc>
+      </w:tr>
+      <w:tr>
+        <w:tc>
+          <w:tcPr>
+            <w:tcW w:type="dxa" w:w="4680"/>
+          </w:tcPr>
+          <w:p>
+            <w:r>
+              <w:t>Cap at one seal per title (first qualifying review wins)</w:t>
+            </w:r>
+          </w:p>
+        </w:tc>
+        <w:tc>
+          <w:tcPr>
+            <w:tcW w:type="dxa" w:w="4680"/>
+          </w:tcPr>
+          <w:p>
+            <w:r>
+              <w:t>Matches the user's initially-stated intent literally, but removes the personal incentive (reputation points, personal credit) for anyone who writes an equally great review of a title that's already sealed — works against the stated 'motivate people to write reviews' goal for every title after its first sealed review.</w:t>
+            </w:r>
+          </w:p>
+        </w:tc>
+      </w:tr>
+      <w:tr>
+        <w:tc>
+          <w:tcPr>
+            <w:tcW w:type="dxa" w:w="4680"/>
+          </w:tcPr>
+          <w:p>
+            <w:r>
+              <w:t>Leave uncapped (current behavior) — chosen</w:t>
+            </w:r>
+          </w:p>
+        </w:tc>
+        <w:tc>
+          <w:tcPr>
+            <w:tcW w:type="dxa" w:w="4680"/>
+          </w:tcPr>
+          <w:p>
+            <w:r>
+              <w:t>Every reviewer keeps a reason to write a genuinely great review regardless of whether the title is already sealed, since their own review can still independently earn the seal and its personal reward (25 reputation points, Entry 39's weighting). Discovery is unaffected either way, since the app already treats 'certifiedBangerCount &gt; 0' as the boolean that makes a title show up as Certified Banger (WHERE certifiedBangerCount: { gt: 0 } — the homepage showcase, /seals, and the sort-by-seals option all key off this, not the exact count).</w:t>
+            </w:r>
+          </w:p>
+        </w:tc>
+      </w:tr>
+    </w:tbl>
+    <w:p>
+      <w:pPr>
+        <w:spacing w:after="120"/>
+      </w:pPr>
+    </w:p>
+    <w:p>
+      <w:pPr>
+        <w:pStyle w:val="Heading2"/>
+      </w:pPr>
+      <w:r>
+        <w:t>Decision made</w:t>
+      </w:r>
+    </w:p>
+    <w:p>
+      <w:r>
+        <w:t>Kept checkAutoSealCandidacy and certifiedBangerCount exactly as they were — no code change to the granting logic. Resolved the actual discrepancy in the hero copy instead (Entry 69's three-step explainer): dropped the numeric claim entirely rather than asserting 'one' (inaccurate to the real behavior) or 'more than one' (accurate but reads as an implementation detail leaking into marketing copy, which is what actually read as 'wrong' to the user even though the underlying number was correct). The seal-earning step now just says a review earns the seal and helps the title get found, without claiming a specific count either way.</w:t>
+      </w:r>
+    </w:p>
+    <w:p>
+      <w:pPr>
+        <w:pStyle w:val="Heading2"/>
+      </w:pPr>
+      <w:r>
+        <w:t>Why this decision was made</w:t>
+      </w:r>
+    </w:p>
+    <w:p>
+      <w:r>
+        <w:t>Chose not to just implement whichever the user said first, since they explicitly signaled uncertainty rather than a firm requirement — surfacing the incentive-design trade-off (capped vs. uncapped, evaluated against their own stated 'motivate reviews' goal) gave them the information needed to make an informed call rather than defaulting to either option. This is the same pattern as other clarifying-question moments this session (the AniList mirror refresh cadence, the region-pin choice): when a request implies a consequential, hard-to-reverse code change and the user isn't certain, lay out the real trade-off against their own stated goals rather than picking a side and implementing silently.</w:t>
       </w:r>
     </w:p>
     <w:p/>

</xml_diff>

<commit_message>
Journal: log Entry 71 -- "discovered by" credit feature
</commit_message>
<xml_diff>
--- a/Projectinformation/Development_Journal.docx
+++ b/Projectinformation/Development_Journal.docx
@@ -12551,6 +12551,120 @@
     <w:p>
       <w:r>
         <w:t>Chose not to just implement whichever the user said first, since they explicitly signaled uncertainty rather than a firm requirement — surfacing the incentive-design trade-off (capped vs. uncapped, evaluated against their own stated 'motivate reviews' goal) gave them the information needed to make an informed call rather than defaulting to either option. This is the same pattern as other clarifying-question moments this session (the AniList mirror refresh cadence, the region-pin choice): when a request implies a consequential, hard-to-reverse code change and the user isn't certain, lay out the real trade-off against their own stated goals rather than picking a side and implementing silently.</w:t>
+      </w:r>
+    </w:p>
+    <w:p/>
+    <w:p>
+      <w:pPr>
+        <w:pStyle w:val="Heading1"/>
+        <w:spacing w:before="360"/>
+      </w:pPr>
+      <w:r>
+        <w:t>Entry 71: "Discovered By" Credit for the First Certified Banger Review</w:t>
+      </w:r>
+    </w:p>
+    <w:p>
+      <w:pPr>
+        <w:spacing w:after="80"/>
+      </w:pPr>
+      <w:r>
+        <w:rPr>
+          <w:rStyle w:val="FieldLabel"/>
+        </w:rPr>
+        <w:t xml:space="preserve">Date: </w:t>
+      </w:r>
+      <w:r>
+        <w:t>2026-08-25</w:t>
+      </w:r>
+    </w:p>
+    <w:p>
+      <w:pPr>
+        <w:spacing w:after="80"/>
+      </w:pPr>
+      <w:r>
+        <w:rPr>
+          <w:rStyle w:val="FieldLabel"/>
+        </w:rPr>
+        <w:t xml:space="preserve">Type: </w:t>
+      </w:r>
+      <w:r>
+        <w:t>Decision</w:t>
+      </w:r>
+    </w:p>
+    <w:p>
+      <w:pPr>
+        <w:spacing w:after="80"/>
+      </w:pPr>
+      <w:r>
+        <w:rPr>
+          <w:rStyle w:val="FieldLabel"/>
+        </w:rPr>
+        <w:t xml:space="preserve">Status: </w:t>
+      </w:r>
+      <w:r>
+        <w:rPr>
+          <w:b/>
+          <w:color w:val="2E7D32"/>
+        </w:rPr>
+        <w:t>Resolved</w:t>
+      </w:r>
+    </w:p>
+    <w:p>
+      <w:pPr>
+        <w:spacing w:after="80"/>
+      </w:pPr>
+      <w:r>
+        <w:rPr>
+          <w:rStyle w:val="FieldLabel"/>
+        </w:rPr>
+        <w:t xml:space="preserve">Relates To: </w:t>
+      </w:r>
+      <w:r>
+        <w:t>Follow-up to a brainstorm on non-monetary ways to motivate honest reviews and voting (raised after the user floated and then set aside a pump.fun token-reward idea) — of the alternatives discussed, permanently crediting whoever's review first earned a title its seal was the clearest fit, since it rewards the platform's own stated mission (surfacing hidden-gem titles) directly rather than generic activity.</w:t>
+      </w:r>
+    </w:p>
+    <w:p>
+      <w:pPr>
+        <w:pStyle w:val="Heading2"/>
+      </w:pPr>
+      <w:r>
+        <w:t>What this step was about</w:t>
+      </w:r>
+    </w:p>
+    <w:p>
+      <w:r>
+        <w:t>Title gained discoveredByUserId/discoveredAt, set once and never reassigned by a new maybeSetDiscoveredBy() helper (src/lib/title-aggregates.ts) called from both places a Certified Banger SealAward can be created: the vote-threshold path (checkAutoSealCandidacy, src/lib/seal-probation.ts) and the admin-grant path (grantSeal, src/lib/actions/seals.ts — guarded to the Certified Banger seal type specifically, since an admin can grant any seal type). Displayed as '🏅 Discovered by [username]' on the title detail page and as a 'Discovered' count stat on user profiles.</w:t>
+      </w:r>
+    </w:p>
+    <w:p>
+      <w:r>
+        <w:t>No new discoveredByReviewId column — Review's existing (userId, titleId) unique constraint already makes 'this user's review for this title' unambiguous and lookup-able whenever needed, so a second FK would be redundant. discoveredByUserId got its own index proactively (@@index([discoveredByUserId]) on Title), continuing the discipline from Entries 58/59/66 of indexing every Title filter/join column up front rather than waiting for it to bite at the mirrored catalog's 100k+-row scale.</w:t>
+      </w:r>
+    </w:p>
+    <w:p>
+      <w:pPr>
+        <w:pStyle w:val="Heading2"/>
+      </w:pPr>
+      <w:r>
+        <w:t>Decision made</w:t>
+      </w:r>
+    </w:p>
+    <w:p>
+      <w:r>
+        <w:t>maybeSetDiscoveredBy uses an atomic updateMany with discoveredByUserId: null in the where clause, so the credit is race-safe and set exactly once. Deliberately did not wire revokeSeal (the admin's mistake-correction escape hatch) to clear or reassign the credit when the triggering seal is later revoked — recomputing 'who's the next-earliest still-valid discoverer' needs a full re-scan of a title's remaining seals, real logic for a case that's already rare in the existing code, so v1 treats the credit as permanent-once-earned and flags reassignment-on-revoke as a follow-up rather than building it speculatively. Also scoped to two display spots (title detail page, profile stat count) and left TitleCardGrid's hover popover / homepage showcase out of this pass, since all four TitleCardGrid callers would need the relation added to their queries for comparatively low immediate value.</w:t>
+      </w:r>
+    </w:p>
+    <w:p>
+      <w:pPr>
+        <w:pStyle w:val="Heading2"/>
+      </w:pPr>
+      <w:r>
+        <w:t>Why this decision was made</w:t>
+      </w:r>
+    </w:p>
+    <w:p>
+      <w:r>
+        <w:t>Kept the same 'index every Title column proactively' and 'don't build speculative reassignment logic for a rare admin edge case' judgment calls this session already established, rather than re-deriving them from scratch. No new unit test was written for maybeSetDiscoveredBy — unlike Entry 64's targets (streak state transition, reputation formula), it's a single conditional write with no non-trivial calculation to isolate, and forcing an extraction just to have a test would be the over-testing Entry 64 explicitly avoided. Verified via db:push (the Entry 63 safety wrapper) + prisma generate, then a clean tsc/eslint/vitest (61 tests, all pre-existing, untouched)/next build.</w:t>
       </w:r>
     </w:p>
     <w:p/>

</xml_diff>

<commit_message>
Journal: log Entry 72 -- AI recommendation chatbot
</commit_message>
<xml_diff>
--- a/Projectinformation/Development_Journal.docx
+++ b/Projectinformation/Development_Journal.docx
@@ -12665,6 +12665,120 @@
     <w:p>
       <w:r>
         <w:t>Kept the same 'index every Title column proactively' and 'don't build speculative reassignment logic for a rare admin edge case' judgment calls this session already established, rather than re-deriving them from scratch. No new unit test was written for maybeSetDiscoveredBy — unlike Entry 64's targets (streak state transition, reputation formula), it's a single conditional write with no non-trivial calculation to isolate, and forcing an extraction just to have a test would be the over-testing Entry 64 explicitly avoided. Verified via db:push (the Entry 63 safety wrapper) + prisma generate, then a clean tsc/eslint/vitest (61 tests, all pre-existing, untouched)/next build.</w:t>
+      </w:r>
+    </w:p>
+    <w:p/>
+    <w:p>
+      <w:pPr>
+        <w:pStyle w:val="Heading1"/>
+        <w:spacing w:before="360"/>
+      </w:pPr>
+      <w:r>
+        <w:t>Entry 72: AI Recommendation Chatbot (Google Gemini, Tool-Calling)</w:t>
+      </w:r>
+    </w:p>
+    <w:p>
+      <w:pPr>
+        <w:spacing w:after="80"/>
+      </w:pPr>
+      <w:r>
+        <w:rPr>
+          <w:rStyle w:val="FieldLabel"/>
+        </w:rPr>
+        <w:t xml:space="preserve">Date: </w:t>
+      </w:r>
+      <w:r>
+        <w:t>2026-08-25</w:t>
+      </w:r>
+    </w:p>
+    <w:p>
+      <w:pPr>
+        <w:spacing w:after="80"/>
+      </w:pPr>
+      <w:r>
+        <w:rPr>
+          <w:rStyle w:val="FieldLabel"/>
+        </w:rPr>
+        <w:t xml:space="preserve">Type: </w:t>
+      </w:r>
+      <w:r>
+        <w:t>Decision</w:t>
+      </w:r>
+    </w:p>
+    <w:p>
+      <w:pPr>
+        <w:spacing w:after="80"/>
+      </w:pPr>
+      <w:r>
+        <w:rPr>
+          <w:rStyle w:val="FieldLabel"/>
+        </w:rPr>
+        <w:t xml:space="preserve">Status: </w:t>
+      </w:r>
+      <w:r>
+        <w:rPr>
+          <w:b/>
+          <w:color w:val="2E7D32"/>
+        </w:rPr>
+        <w:t>Resolved</w:t>
+      </w:r>
+    </w:p>
+    <w:p>
+      <w:pPr>
+        <w:spacing w:after="80"/>
+      </w:pPr>
+      <w:r>
+        <w:rPr>
+          <w:rStyle w:val="FieldLabel"/>
+        </w:rPr>
+        <w:t xml:space="preserve">Relates To: </w:t>
+      </w:r>
+      <w:r>
+        <w:t>Requested directly: a chatbot for simple conversation that can also recommend titles based on genre preferences and this site's own reviews, excluding a logged-in user's library.</w:t>
+      </w:r>
+    </w:p>
+    <w:p>
+      <w:pPr>
+        <w:pStyle w:val="Heading2"/>
+      </w:pPr>
+      <w:r>
+        <w:t>What this step was about</w:t>
+      </w:r>
+    </w:p>
+    <w:p>
+      <w:r>
+        <w:t>Added a floating chat widget (every page, via the root layout) backed by a new POST /api/chat route handler calling the Google Gemini API (gemini-2.5-flash) — chosen over Anthropic/OpenAI specifically because it has a real, ongoing free tier with no billing required, after the user asked directly whether this could be built for free. Conversation history is ephemeral (client-side React state only, resets on reload) and genre preference is gathered by the bot asking in conversation, not inferred from account history — both explicit trade-offs the user picked over the alternatives when asked.</w:t>
+      </w:r>
+    </w:p>
+    <w:p>
+      <w:r>
+        <w:t>The model is never trusted to name real titles from its own training data — it's given exactly one whitelisted function tool, recommend_titles (src/lib/chat/recommend-titles.ts), and the system prompt explicitly forbids inventing a title the tool didn't return, the same 'ground it in a real query, don't let the model hallucinate data' discipline as everywhere else in this app (e.g. Entry 69's copy-accuracy check). The tool queries titles with reviewCount &gt; 0 (this site's own reviews, not the raw AniList mirror) ordered by certifiedBangerCount/communityScore/reviewCount, and excludes the authenticated user's library via a `libraryEntries: { none: { userId } }` Prisma filter. Critically, that userId comes from getCurrentUser() (src/lib/auth.ts) called server-side inside the route handler itself, never from the request body or the model's output — so the exclusion can't be spoofed by a manipulated client request or a jailbroken conversation.</w:t>
+      </w:r>
+    </w:p>
+    <w:p>
+      <w:pPr>
+        <w:pStyle w:val="Heading2"/>
+      </w:pPr>
+      <w:r>
+        <w:t>Decision made</w:t>
+      </w:r>
+    </w:p>
+    <w:p>
+      <w:r>
+        <w:t>Manual tool-call loop (src/lib/chat/gemini.ts, capped at 3 rounds) rather than the SDK's CallableTool/automatic-function-calling path, which existed but would have meant learning and trusting an unfamiliar interface under time pressure versus building the well-documented, standard multi-turn function-calling flow (model returns a functionCall part -&gt; execute server-side -&gt; echo a functionResponse part back -&gt; repeat) directly. Three deliberate v1 simplifications, flagged rather than silently skipped: no new database table/custom rate limit (Gemini's own free-tier quota is the real backstop against runaway cost, since it's free either way); no semantic/keyword search across review text (recommendations rank by this site's existing community signals, not free-text theme matching); no streaming responses (plain request/await/JSON per turn).</w:t>
+      </w:r>
+    </w:p>
+    <w:p>
+      <w:pPr>
+        <w:pStyle w:val="Heading2"/>
+      </w:pPr>
+      <w:r>
+        <w:t>Why this decision was made</w:t>
+      </w:r>
+    </w:p>
+    <w:p>
+      <w:r>
+        <w:t>Verified end-to-end short of an actual API key: build/typecheck/lint/vitest (61 pre-existing tests, untouched, still green) all clean, and curl-tested the route handler directly — malformed-body, empty-messages, and wrong-final-role all return the correct 400s, and a real chat turn against a placeholder (unset) GEMINI_API_KEY correctly hit the Gemini API's 403, got caught, and returned the intended friendly fallback reply rather than a raw 500, confirming the whole request pipeline and error path work correctly independent of the key itself. The actual conversational quality and the library-exclusion behavior with a real account need a real GEMINI_API_KEY and a browser session to verify, which is out of reach in this environment — stated explicitly as the one remaining verification gap rather than claimed as tested.</w:t>
       </w:r>
     </w:p>
     <w:p/>

</xml_diff>

<commit_message>
Journal: log Entry 73 -- chatbot live-testing fixes
</commit_message>
<xml_diff>
--- a/Projectinformation/Development_Journal.docx
+++ b/Projectinformation/Development_Journal.docx
@@ -29,7 +29,7 @@
         <w:jc w:val="center"/>
       </w:pPr>
       <w:r>
-        <w:t>Generated 2026-08-25</w:t>
+        <w:t>Generated 2026-08-26</w:t>
       </w:r>
     </w:p>
     <w:p/>
@@ -12779,6 +12779,120 @@
     <w:p>
       <w:r>
         <w:t>Verified end-to-end short of an actual API key: build/typecheck/lint/vitest (61 pre-existing tests, untouched, still green) all clean, and curl-tested the route handler directly — malformed-body, empty-messages, and wrong-final-role all return the correct 400s, and a real chat turn against a placeholder (unset) GEMINI_API_KEY correctly hit the Gemini API's 403, got caught, and returned the intended friendly fallback reply rather than a raw 500, confirming the whole request pipeline and error path work correctly independent of the key itself. The actual conversational quality and the library-exclusion behavior with a real account need a real GEMINI_API_KEY and a browser session to verify, which is out of reach in this environment — stated explicitly as the one remaining verification gap rather than claimed as tested.</w:t>
+      </w:r>
+    </w:p>
+    <w:p/>
+    <w:p>
+      <w:pPr>
+        <w:pStyle w:val="Heading1"/>
+        <w:spacing w:before="360"/>
+      </w:pPr>
+      <w:r>
+        <w:t>Entry 73: Chatbot Live-Tested Against a Real Gemini Key — Two Real-World Fixes</w:t>
+      </w:r>
+    </w:p>
+    <w:p>
+      <w:pPr>
+        <w:spacing w:after="80"/>
+      </w:pPr>
+      <w:r>
+        <w:rPr>
+          <w:rStyle w:val="FieldLabel"/>
+        </w:rPr>
+        <w:t xml:space="preserve">Date: </w:t>
+      </w:r>
+      <w:r>
+        <w:t>2026-08-26</w:t>
+      </w:r>
+    </w:p>
+    <w:p>
+      <w:pPr>
+        <w:spacing w:after="80"/>
+      </w:pPr>
+      <w:r>
+        <w:rPr>
+          <w:rStyle w:val="FieldLabel"/>
+        </w:rPr>
+        <w:t xml:space="preserve">Type: </w:t>
+      </w:r>
+      <w:r>
+        <w:t>Bugfix</w:t>
+      </w:r>
+    </w:p>
+    <w:p>
+      <w:pPr>
+        <w:spacing w:after="80"/>
+      </w:pPr>
+      <w:r>
+        <w:rPr>
+          <w:rStyle w:val="FieldLabel"/>
+        </w:rPr>
+        <w:t xml:space="preserve">Status: </w:t>
+      </w:r>
+      <w:r>
+        <w:rPr>
+          <w:b/>
+          <w:color w:val="2E7D32"/>
+        </w:rPr>
+        <w:t>Resolved</w:t>
+      </w:r>
+    </w:p>
+    <w:p>
+      <w:pPr>
+        <w:spacing w:after="80"/>
+      </w:pPr>
+      <w:r>
+        <w:rPr>
+          <w:rStyle w:val="FieldLabel"/>
+        </w:rPr>
+        <w:t xml:space="preserve">Relates To: </w:t>
+      </w:r>
+      <w:r>
+        <w:t>Direct follow-up to Entry 72, once the user added a real GEMINI_API_KEY to their local .env and asked to try it out on localhost.</w:t>
+      </w:r>
+    </w:p>
+    <w:p>
+      <w:pPr>
+        <w:pStyle w:val="Heading2"/>
+      </w:pPr>
+      <w:r>
+        <w:t>What this step was about</w:t>
+      </w:r>
+    </w:p>
+    <w:p>
+      <w:r>
+        <w:t>The two things Entry 72 flagged as untestable without a real key were exactly where the real bugs were, confirming that error-path testing against a missing/placeholder key — while worth doing — can't stand in for testing against the live API. First real request surfaced that gemini-2.5-flash (named directly in the plan) is no longer available to new users; Gemini's own 404 named the replacement (gemini-3.6-flash) directly. Second, the first real recommendation request (the tool-calling path) failed with a 400 'Function call is missing a thought_signature' — Gemini 3's function-call parts carry a thought_signature the API requires to be echoed back verbatim on the next turn, which src/lib/chat/gemini.ts's runChat was silently discarding by reconstructing fresh Part objects from just the FunctionCall's name/args instead of reusing the model's actual response parts.</w:t>
+      </w:r>
+    </w:p>
+    <w:p>
+      <w:r>
+        <w:t>Both bugs were only reachable by actually calling the live Gemini API — no amount of type-checking, unit testing, or curl testing against a missing key could have caught either, since the SDK's TypeScript types don't encode which model strings are still live, and the thought_signature requirement is a runtime contract on Part objects, not something the FunctionCall type surfaces at all.</w:t>
+      </w:r>
+    </w:p>
+    <w:p>
+      <w:pPr>
+        <w:pStyle w:val="Heading2"/>
+      </w:pPr>
+      <w:r>
+        <w:t>Decision made</w:t>
+      </w:r>
+    </w:p>
+    <w:p>
+      <w:r>
+        <w:t>Updated the MODEL constant to gemini-3.6-flash. Changed runChat's tool-call loop to grab response.candidates[0].content.parts directly (which includes each part's thoughtSignature field) and push that whole array back as the next 'model' content verbatim, rather than calling response.functionCalls (which returns bare FunctionCall objects with no thoughtSignature) and rebuilding new parts from them via createPartFromFunctionCall.</w:t>
+      </w:r>
+    </w:p>
+    <w:p>
+      <w:pPr>
+        <w:pStyle w:val="Heading2"/>
+      </w:pPr>
+      <w:r>
+        <w:t>Why this decision was made</w:t>
+      </w:r>
+    </w:p>
+    <w:p>
+      <w:r>
+        <w:t>Verified with three real conversations against the live API: plain chat, a single-turn genre-based recommendation (correctly returned real catalog titles with real cover URLs, ranked by the site's own community signals), and a multi-turn follow-up that correctly switched genre focus using the prior turns as context — confirming the fix actually resolved the thought_signature error rather than just changing the failure mode. Library-exclusion for a logged-in account still wasn't verified (no test credentials available to this session for a cookie-authenticated curl request) — left for the user to confirm in their own logged-in browser session, the same honestly-flagged gap as Entry 72.</w:t>
       </w:r>
     </w:p>
     <w:p/>

</xml_diff>

<commit_message>
Journal: log Entry 74 -- closed test-coverage gaps
</commit_message>
<xml_diff>
--- a/Projectinformation/Development_Journal.docx
+++ b/Projectinformation/Development_Journal.docx
@@ -12893,6 +12893,120 @@
     <w:p>
       <w:r>
         <w:t>Verified with three real conversations against the live API: plain chat, a single-turn genre-based recommendation (correctly returned real catalog titles with real cover URLs, ranked by the site's own community signals), and a multi-turn follow-up that correctly switched genre focus using the prior turns as context — confirming the fix actually resolved the thought_signature error rather than just changing the failure mode. Library-exclusion for a logged-in account still wasn't verified (no test credentials available to this session for a cookie-authenticated curl request) — left for the user to confirm in their own logged-in browser session, the same honestly-flagged gap as Entry 72.</w:t>
+      </w:r>
+    </w:p>
+    <w:p/>
+    <w:p>
+      <w:pPr>
+        <w:pStyle w:val="Heading1"/>
+        <w:spacing w:before="360"/>
+      </w:pPr>
+      <w:r>
+        <w:t>Entry 74: Closed the Two Test-Coverage Gaps Flagged by the Clean-Code/Architecture Review</w:t>
+      </w:r>
+    </w:p>
+    <w:p>
+      <w:pPr>
+        <w:spacing w:after="80"/>
+      </w:pPr>
+      <w:r>
+        <w:rPr>
+          <w:rStyle w:val="FieldLabel"/>
+        </w:rPr>
+        <w:t xml:space="preserve">Date: </w:t>
+      </w:r>
+      <w:r>
+        <w:t>2026-08-26</w:t>
+      </w:r>
+    </w:p>
+    <w:p>
+      <w:pPr>
+        <w:spacing w:after="80"/>
+      </w:pPr>
+      <w:r>
+        <w:rPr>
+          <w:rStyle w:val="FieldLabel"/>
+        </w:rPr>
+        <w:t xml:space="preserve">Type: </w:t>
+      </w:r>
+      <w:r>
+        <w:t>Decision</w:t>
+      </w:r>
+    </w:p>
+    <w:p>
+      <w:pPr>
+        <w:spacing w:after="80"/>
+      </w:pPr>
+      <w:r>
+        <w:rPr>
+          <w:rStyle w:val="FieldLabel"/>
+        </w:rPr>
+        <w:t xml:space="preserve">Status: </w:t>
+      </w:r>
+      <w:r>
+        <w:rPr>
+          <w:b/>
+          <w:color w:val="2E7D32"/>
+        </w:rPr>
+        <w:t>Resolved</w:t>
+      </w:r>
+    </w:p>
+    <w:p>
+      <w:pPr>
+        <w:spacing w:after="80"/>
+      </w:pPr>
+      <w:r>
+        <w:rPr>
+          <w:rStyle w:val="FieldLabel"/>
+        </w:rPr>
+        <w:t xml:space="preserve">Relates To: </w:t>
+      </w:r>
+      <w:r>
+        <w:t>Direct follow-up to a clean-code/architecture self-assessment the user asked for, which named two concrete gaps: the /api/chat route's request validation and src/lib/actions/seals.ts were the freshest untested surface, both introduced by Entries 71-73.</w:t>
+      </w:r>
+    </w:p>
+    <w:p>
+      <w:pPr>
+        <w:pStyle w:val="Heading2"/>
+      </w:pPr>
+      <w:r>
+        <w:t>What this step was about</w:t>
+      </w:r>
+    </w:p>
+    <w:p>
+      <w:r>
+        <w:t>Extracted the chat route's inline message-validation logic (shape filtering, MAX_MESSAGE_LENGTH truncation, MAX_HISTORY_TURNS cap, 'must end with a user turn') into a new pure function, parseChatMessages (src/lib/chat/parse-messages.ts) — the same 'extract DB/route-coupled logic into a small pure function' pattern as Entry 64's computeNextStreakState/computeCommunityScore. Added src/lib/actions/seals.test.ts covering grantSeal and revokeSeal, following the existing vi.hoisted/vi.mock pattern from votes.test.ts and reviews.test.ts.</w:t>
+      </w:r>
+    </w:p>
+    <w:p>
+      <w:r>
+        <w:t>The seals.ts tests specifically pin down the Entry 71 conditional that had no coverage: maybeSetDiscoveredBy is called when an admin grants a Certified Banger seal, and is NOT called when the granted seal is any other seal type — the exact scoping rule that made grantSeal need a guard in the first place. A separate test also pins down that revokeSeal never touches discovered-by credit at all, matching Entry 71's deliberate 'permanent once earned' decision.</w:t>
+      </w:r>
+    </w:p>
+    <w:p>
+      <w:pPr>
+        <w:pStyle w:val="Heading2"/>
+      </w:pPr>
+      <w:r>
+        <w:t>Decision made</w:t>
+      </w:r>
+    </w:p>
+    <w:p>
+      <w:r>
+        <w:t>82 tests total now (61 existing + 21 new across the two new files), all passing; build/typecheck/lint stayed clean throughout.</w:t>
+      </w:r>
+    </w:p>
+    <w:p>
+      <w:pPr>
+        <w:pStyle w:val="Heading2"/>
+      </w:pPr>
+      <w:r>
+        <w:t>Why this decision was made</w:t>
+      </w:r>
+    </w:p>
+    <w:p>
+      <w:r>
+        <w:t>This closes both gaps the self-assessment named without expanding scope beyond what was actually flagged — no attempt to backfill tests for the other 12 untested action modules, which weren't part of what was asked and don't have the same freshly-added, previously-unverified conditional logic that seals.ts and the chat route did.</w:t>
       </w:r>
     </w:p>
     <w:p/>

</xml_diff>

<commit_message>
Journal: log Entry 75 -- motion & polish pass
</commit_message>
<xml_diff>
--- a/Projectinformation/Development_Journal.docx
+++ b/Projectinformation/Development_Journal.docx
@@ -13007,6 +13007,120 @@
     <w:p>
       <w:r>
         <w:t>This closes both gaps the self-assessment named without expanding scope beyond what was actually flagged — no attempt to backfill tests for the other 12 untested action modules, which weren't part of what was asked and don't have the same freshly-added, previously-unverified conditional logic that seals.ts and the chat route did.</w:t>
+      </w:r>
+    </w:p>
+    <w:p/>
+    <w:p>
+      <w:pPr>
+        <w:pStyle w:val="Heading1"/>
+        <w:spacing w:before="360"/>
+      </w:pPr>
+      <w:r>
+        <w:t>Entry 75: Motion &amp; Polish Pass</w:t>
+      </w:r>
+    </w:p>
+    <w:p>
+      <w:pPr>
+        <w:spacing w:after="80"/>
+      </w:pPr>
+      <w:r>
+        <w:rPr>
+          <w:rStyle w:val="FieldLabel"/>
+        </w:rPr>
+        <w:t xml:space="preserve">Date: </w:t>
+      </w:r>
+      <w:r>
+        <w:t>2026-08-26</w:t>
+      </w:r>
+    </w:p>
+    <w:p>
+      <w:pPr>
+        <w:spacing w:after="80"/>
+      </w:pPr>
+      <w:r>
+        <w:rPr>
+          <w:rStyle w:val="FieldLabel"/>
+        </w:rPr>
+        <w:t xml:space="preserve">Type: </w:t>
+      </w:r>
+      <w:r>
+        <w:t>Decision</w:t>
+      </w:r>
+    </w:p>
+    <w:p>
+      <w:pPr>
+        <w:spacing w:after="80"/>
+      </w:pPr>
+      <w:r>
+        <w:rPr>
+          <w:rStyle w:val="FieldLabel"/>
+        </w:rPr>
+        <w:t xml:space="preserve">Status: </w:t>
+      </w:r>
+      <w:r>
+        <w:rPr>
+          <w:b/>
+          <w:color w:val="2E7D32"/>
+        </w:rPr>
+        <w:t>Resolved</w:t>
+      </w:r>
+    </w:p>
+    <w:p>
+      <w:pPr>
+        <w:spacing w:after="80"/>
+      </w:pPr>
+      <w:r>
+        <w:rPr>
+          <w:rStyle w:val="FieldLabel"/>
+        </w:rPr>
+        <w:t xml:space="preserve">Relates To: </w:t>
+      </w:r>
+      <w:r>
+        <w:t>Requested directly: make the site feel more modern. Given how many genuinely different things 'modern' could mean (glass/blur, bolder/more-spacious layout, or motion/polish), asked the user to pick a direction rather than guessing on a broad, hard-to-course-correct sweep — they chose motion &amp; polish: subtle entrance animations and tactile micro-interactions, keeping the existing dark/amber look rather than changing it.</w:t>
+      </w:r>
+    </w:p>
+    <w:p>
+      <w:pPr>
+        <w:pStyle w:val="Heading2"/>
+      </w:pPr>
+      <w:r>
+        <w:t>What this step was about</w:t>
+      </w:r>
+    </w:p>
+    <w:p>
+      <w:r>
+        <w:t>Two CSS-only entrance animations registered as real Tailwind utilities via --animate-* theme tokens in globals.css (the same mechanism --font-display already used) sharing one `reveal` keyframe (fade + translateY(14px)-&gt;0): animate-reveal plays once on mount with a staggered animation-delay per element, used on the homepage hero (heading, subhead, illustration, the three how-it-works cards, the search form); animate-reveal-on-scroll instead drives off scroll position via animation-timeline: view() (no JavaScript, no IntersectionObserver) so below-the-fold cards animate in as they individually enter the viewport rather than all at once on page load.</w:t>
+      </w:r>
+    </w:p>
+    <w:p>
+      <w:r>
+        <w:t>Applied the scroll-driven version to TitleCardGrid and LatestReviews specifically (not a wrapping section div) — those two components are shared across the homepage, /titles, /seals, /profile, and /feed, so every card grid site-wide got the treatment from two edits rather than one per page. Also added active:scale-95 (buttons) / active:scale-[0.98] (cards) press feedback to BUTTON_PRIMARY/SECONDARY/GHOST/DANGER and CARD_HOVER in ui-classes.ts — the same 'edit the shared constant once' leverage as every prior design pass in this project.</w:t>
+      </w:r>
+    </w:p>
+    <w:p>
+      <w:pPr>
+        <w:pStyle w:val="Heading2"/>
+      </w:pPr>
+      <w:r>
+        <w:t>Decision made</w:t>
+      </w:r>
+    </w:p>
+    <w:p>
+      <w:r>
+        <w:t>animation-timeline: view() was chosen over an IntersectionObserver-based client component specifically to avoid converting server-rendered card grids into client components just for decorative motion — a browser that doesn't support it simply never starts the animation, leaving the element at its plain static (fully visible) styles, which is why opacity:0 only ever appears inside the keyframes, never as a static base style. A `prefers-reduced-motion: reduce` media query disables both animations outright.</w:t>
+      </w:r>
+    </w:p>
+    <w:p>
+      <w:pPr>
+        <w:pStyle w:val="Heading2"/>
+      </w:pPr>
+      <w:r>
+        <w:t>Why this decision was made</w:t>
+      </w:r>
+    </w:p>
+    <w:p>
+      <w:r>
+        <w:t>Verified past the usual build/typecheck/lint/vitest (82 tests, unaffected, still green): grepped the actual compiled production CSS chunk directly for the generated .animate-reveal/.animate-reveal-on-scroll utilities, the @keyframes reveal block, and confirmed the reduced-motion override was correctly nested inside its @media block and not applied unconditionally — Tailwind's custom-theme-token-to-utility generation was a real, unverified assumption at write time (Entry 67 used the same --theme-token mechanism for --font-display, but a typo or unsupported property in a --animate-* token could silently fail to generate anything), so this was confirmed rather than assumed. Also curl-grepped the actual rendered HTML on both / and /titles to confirm the classes land on real elements, not just in the stylesheet. Genuinely could not verify the animations look smooth/right in a live browser (no browser tool available this session) — stated as the one remaining gap, same as every other visual pass this session.</w:t>
       </w:r>
     </w:p>
     <w:p/>

</xml_diff>

<commit_message>
Journal: log Entry 76 -- synopsis HTML-tag fix
</commit_message>
<xml_diff>
--- a/Projectinformation/Development_Journal.docx
+++ b/Projectinformation/Development_Journal.docx
@@ -13121,6 +13121,120 @@
     <w:p>
       <w:r>
         <w:t>Verified past the usual build/typecheck/lint/vitest (82 tests, unaffected, still green): grepped the actual compiled production CSS chunk directly for the generated .animate-reveal/.animate-reveal-on-scroll utilities, the @keyframes reveal block, and confirmed the reduced-motion override was correctly nested inside its @media block and not applied unconditionally — Tailwind's custom-theme-token-to-utility generation was a real, unverified assumption at write time (Entry 67 used the same --theme-token mechanism for --font-display, but a typo or unsupported property in a --animate-* token could silently fail to generate anything), so this was confirmed rather than assumed. Also curl-grepped the actual rendered HTML on both / and /titles to confirm the classes land on real elements, not just in the stylesheet. Genuinely could not verify the animations look smooth/right in a live browser (no browser tool available this session) — stated as the one remaining gap, same as every other visual pass this session.</w:t>
+      </w:r>
+    </w:p>
+    <w:p/>
+    <w:p>
+      <w:pPr>
+        <w:pStyle w:val="Heading1"/>
+        <w:spacing w:before="360"/>
+      </w:pPr>
+      <w:r>
+        <w:t>Entry 76: Synopsis Showing Raw AniList Formatting Tags</w:t>
+      </w:r>
+    </w:p>
+    <w:p>
+      <w:pPr>
+        <w:spacing w:after="80"/>
+      </w:pPr>
+      <w:r>
+        <w:rPr>
+          <w:rStyle w:val="FieldLabel"/>
+        </w:rPr>
+        <w:t xml:space="preserve">Date: </w:t>
+      </w:r>
+      <w:r>
+        <w:t>2026-08-26</w:t>
+      </w:r>
+    </w:p>
+    <w:p>
+      <w:pPr>
+        <w:spacing w:after="80"/>
+      </w:pPr>
+      <w:r>
+        <w:rPr>
+          <w:rStyle w:val="FieldLabel"/>
+        </w:rPr>
+        <w:t xml:space="preserve">Type: </w:t>
+      </w:r>
+      <w:r>
+        <w:t>Bugfix</w:t>
+      </w:r>
+    </w:p>
+    <w:p>
+      <w:pPr>
+        <w:spacing w:after="80"/>
+      </w:pPr>
+      <w:r>
+        <w:rPr>
+          <w:rStyle w:val="FieldLabel"/>
+        </w:rPr>
+        <w:t xml:space="preserve">Status: </w:t>
+      </w:r>
+      <w:r>
+        <w:rPr>
+          <w:b/>
+          <w:color w:val="2E7D32"/>
+        </w:rPr>
+        <w:t>Resolved</w:t>
+      </w:r>
+    </w:p>
+    <w:p>
+      <w:pPr>
+        <w:spacing w:after="80"/>
+      </w:pPr>
+      <w:r>
+        <w:rPr>
+          <w:rStyle w:val="FieldLabel"/>
+        </w:rPr>
+        <w:t xml:space="preserve">Relates To: </w:t>
+      </w:r>
+      <w:r>
+        <w:t>User-reported: a title page's synopsis displayed literal &lt;b&gt;/&lt;i&gt; tags instead of formatted text — pasted a real example (a doujin title's alternate-chapter-titles list) showing the raw markup.</w:t>
+      </w:r>
+    </w:p>
+    <w:p>
+      <w:pPr>
+        <w:pStyle w:val="Heading2"/>
+      </w:pPr>
+      <w:r>
+        <w:t>What this step was about</w:t>
+      </w:r>
+    </w:p>
+    <w:p>
+      <w:r>
+        <w:t>AniList's GraphQL description(asHtml: false) field only controls whether &lt;br&gt; becomes a real line break — it does NOT strip other inline formatting tags (&lt;b&gt;, &lt;i&gt;, &lt;a&gt;, etc.), which come through as literal text. Both ingestion call sites (src/lib/anilist.ts's mapMediaToImport, used for on-demand single imports; scripts/lib/anilist-sync-shared.ts's mediaToTitleData, used by the mirror/refresh cron) only ever stripped &lt;br&gt; via the same one-line regex, leaving every other tag untouched in ~127k mirrored titles' stored synopsis text.</w:t>
+      </w:r>
+    </w:p>
+    <w:p>
+      <w:r>
+        <w:t>Confirmed live in the database (not just inferred from the report): queried for titles with '&lt;b&gt;' still in their stored synopsis and found real rows, e.g. Boku no Oji-sama's alternate-titles list, matching the same pattern the user's example showed. The daily refresh job (scripts/refresh-anilist-catalog.ts) already re-fetches and overwrites every title's full data including synopsis, so fixing ingestion alone would eventually self-heal all rows within about a day — but that would leave the bug visibly unfixed until the next scheduled run.</w:t>
+      </w:r>
+    </w:p>
+    <w:p>
+      <w:pPr>
+        <w:pStyle w:val="Heading2"/>
+      </w:pPr>
+      <w:r>
+        <w:t>Decision made</w:t>
+      </w:r>
+    </w:p>
+    <w:p>
+      <w:r>
+        <w:t>New src/lib/strip-html.ts (a proper tag-strip + &lt;br&gt;-to-newline + common-entity-decode pure function) replaces the inline regex at both ingestion sites — duplicated rather than shared between them on purpose, since scripts/lib/anilist-sync-shared.ts is deliberately kept unreachable from the Next.js app (see that file's own header comment) and src/lib/strip-html.ts lives on the app side of that boundary. Also applied stripHtml defensively at every display site reading synopsis straight from the database rather than fetching fresh from AniList — the public title page (src/app/titles/[id]/page.tsx) and the admin edit form's defaults (src/app/admin/titles/[id]/page.tsx) — so already-mirrored rows render clean immediately instead of waiting for their next refresh. The AniList live-preview page (src/app/titles/anilist/[anilistId]/page.tsx) needed no defensive fix, since it always calls the now-fixed ingestion path fresh on every render rather than reading stored data. Both display fixes also added whitespace-pre-line so the \n line breaks stripHtml produces actually render as line breaks instead of being collapsed by default paragraph whitespace handling — a separate, pre-existing minor issue in the same rendering code, fixed alongside it since it was already being touched.</w:t>
+      </w:r>
+    </w:p>
+    <w:p>
+      <w:pPr>
+        <w:pStyle w:val="Heading2"/>
+      </w:pPr>
+      <w:r>
+        <w:t>Why this decision was made</w:t>
+      </w:r>
+    </w:p>
+    <w:p>
+      <w:r>
+        <w:t>Wrote src/lib/strip-html.test.ts covering &lt;br&gt;-to-newline conversion, tag-with-attributes stripping, entity decoding, and a regression test using the exact reported bug text verbatim. Verified against live data, not just the test suite: queried the database directly for a real still-dirty row (Boku no Oji-sama), started the dev server, and curl-fetched that exact title's page to confirm the rendered output contains the clean text with no raw or escaped tags. Confirmed the standalone mirror/refresh scripts still typecheck after editing scripts/lib/anilist-sync-shared.ts directly (they're outside the main tsconfig's build graph, so npx tsc --noEmit -p . alone wouldn't have caught a mistake there).</w:t>
       </w:r>
     </w:p>
     <w:p/>

</xml_diff>

<commit_message>
Journal: log Entry 77 -- homepage redesign
</commit_message>
<xml_diff>
--- a/Projectinformation/Development_Journal.docx
+++ b/Projectinformation/Development_Journal.docx
@@ -13235,6 +13235,120 @@
     <w:p>
       <w:r>
         <w:t>Wrote src/lib/strip-html.test.ts covering &lt;br&gt;-to-newline conversion, tag-with-attributes stripping, entity decoding, and a regression test using the exact reported bug text verbatim. Verified against live data, not just the test suite: queried the database directly for a real still-dirty row (Boku no Oji-sama), started the dev server, and curl-fetched that exact title's page to confirm the rendered output contains the clean text with no raw or escaped tags. Confirmed the standalone mirror/refresh scripts still typecheck after editing scripts/lib/anilist-sync-shared.ts directly (they're outside the main tsconfig's build graph, so npx tsc --noEmit -p . alone wouldn't have caught a mistake there).</w:t>
+      </w:r>
+    </w:p>
+    <w:p/>
+    <w:p>
+      <w:pPr>
+        <w:pStyle w:val="Heading1"/>
+        <w:spacing w:before="360"/>
+      </w:pPr>
+      <w:r>
+        <w:t>Entry 77: Homepage Redesign — Sectioned Layout + Sidebar</w:t>
+      </w:r>
+    </w:p>
+    <w:p>
+      <w:pPr>
+        <w:spacing w:after="80"/>
+      </w:pPr>
+      <w:r>
+        <w:rPr>
+          <w:rStyle w:val="FieldLabel"/>
+        </w:rPr>
+        <w:t xml:space="preserve">Date: </w:t>
+      </w:r>
+      <w:r>
+        <w:t>2026-08-26</w:t>
+      </w:r>
+    </w:p>
+    <w:p>
+      <w:pPr>
+        <w:spacing w:after="80"/>
+      </w:pPr>
+      <w:r>
+        <w:rPr>
+          <w:rStyle w:val="FieldLabel"/>
+        </w:rPr>
+        <w:t xml:space="preserve">Type: </w:t>
+      </w:r>
+      <w:r>
+        <w:t>Decision</w:t>
+      </w:r>
+    </w:p>
+    <w:p>
+      <w:pPr>
+        <w:spacing w:after="80"/>
+      </w:pPr>
+      <w:r>
+        <w:rPr>
+          <w:rStyle w:val="FieldLabel"/>
+        </w:rPr>
+        <w:t xml:space="preserve">Status: </w:t>
+      </w:r>
+      <w:r>
+        <w:rPr>
+          <w:b/>
+          <w:color w:val="2E7D32"/>
+        </w:rPr>
+        <w:t>Resolved</w:t>
+      </w:r>
+    </w:p>
+    <w:p>
+      <w:pPr>
+        <w:spacing w:after="80"/>
+      </w:pPr>
+      <w:r>
+        <w:rPr>
+          <w:rStyle w:val="FieldLabel"/>
+        </w:rPr>
+        <w:t xml:space="preserve">Relates To: </w:t>
+      </w:r>
+      <w:r>
+        <w:t>User shared a reference screenshot of a manga-reader homepage and asked for the same layout pattern: a main column of ranked title sections (Recent Reviews, Certified Bangers, Recently Added, Most Follows) plus a right sidebar (Join Discord Community button, a Recently Gained Certified Bangers list below it).</w:t>
+      </w:r>
+    </w:p>
+    <w:p>
+      <w:pPr>
+        <w:pStyle w:val="Heading2"/>
+      </w:pPr>
+      <w:r>
+        <w:t>What this step was about</w:t>
+      </w:r>
+    </w:p>
+    <w:p>
+      <w:r>
+        <w:t>The reference site's 'Most Follows' is a per-title subscribe/bookmark feature this app doesn't have (Follow here is user-to-user only) — asked the user how to map it rather than guessing, and they picked the closest existing proxy: total LibraryEntry count per title, any status, as 'how many readers are tracking this.' Also confirmed with the user: replace the existing Most Popular/Highest Rated sections with the four named ones (rather than keep both sets), keep the hero exactly as-is above the new layout, and ship the Discord button as a placeholder (href="#") since no server exists yet.</w:t>
+      </w:r>
+    </w:p>
+    <w:p>
+      <w:r>
+        <w:t>New precomputed Title.libraryCount (same never-computed-live pattern as reviewCount/certifiedBangerCount/discussionCount), recomputed by recomputeTitleLibraryCount (src/lib/title-aggregates.ts) and wired into all three LibraryEntry-mutating paths in src/lib/actions/library.ts. Backfilled via scripts/backfill-library-counts.ts (modeled on backfill-reputation.ts, reusing the real recompute function rather than duplicating the count logic) — found only 3 titles with any library activity at all, matching the site's actual current low-traffic stage. Two new plain indexes (createdAt for 'Recently Added', discoveredAt for the sidebar's sort) were added without the raw-SQL DESC-NULLS-LAST treatment Entry 58's four sort columns needed, since both queries are always paired with a highly selective filter first (certifiedBangerCount &gt; 0 for discoveredAt's one caller), keeping the actual candidate set small regardless of index shape.</w:t>
+      </w:r>
+    </w:p>
+    <w:p>
+      <w:pPr>
+        <w:pStyle w:val="Heading2"/>
+      </w:pPr>
+      <w:r>
+        <w:t>Decision made</w:t>
+      </w:r>
+    </w:p>
+    <w:p>
+      <w:r>
+        <w:t>TitleCardGrid gained an optional rank prop rendering a numbered corner badge (matching the reference's #1-#5 treatment) for the two new ranked sections only; when a title has both a rank and the existing Certified Banger chip, the chip shifts down (top-8 instead of top-1.5) rather than overlapping. The existing Certified Bangers showcase kept its accent-tinted 'spotlight' identity but changed from a full-bleed, border-y, page-width section to a bounded rounded-2xl card within the main column — a full-width background break is structurally incompatible with a sidebar sitting alongside it in a two-column layout. New src/lib/relative-time.ts (a small pure formatRelativeTime, tested) powers only the sidebar's 'Xm/Xh/Xd ago' timestamps — the rest of the app keeps its existing absolute-date convention everywhere else, this is additive for the one place a recent-activity feed genuinely reads better as relative time.</w:t>
+      </w:r>
+    </w:p>
+    <w:p>
+      <w:pPr>
+        <w:pStyle w:val="Heading2"/>
+      </w:pPr>
+      <w:r>
+        <w:t>Why this decision was made</w:t>
+      </w:r>
+    </w:p>
+    <w:p>
+      <w:r>
+        <w:t>Verified past the usual db:push (Entry 63 wrapper) + prisma generate + backfill + build/typecheck/lint/vitest (93 tests, up from 88): started the dev server and curl-fetched the real rendered homepage HTML, confirming all four section headings, the sidebar's Discord button and seal list, and numbered rank badges (1 through 8, correctly sequential) actually appear in the output — not just that the code compiled. Specifically checked a title known to have a real review score to confirm the rank badge and the existing score/CB badges coexist without visual collision in the markup. Same stated gap as every visual pass this session: actual spacing/proportions of the new two-column layout at different viewport widths needs the user's own look in a browser, which wasn't available here.</w:t>
       </w:r>
     </w:p>
     <w:p/>

</xml_diff>

<commit_message>
Journal: log Entry 78 -- reviews page redesign
</commit_message>
<xml_diff>
--- a/Projectinformation/Development_Journal.docx
+++ b/Projectinformation/Development_Journal.docx
@@ -13349,6 +13349,120 @@
     <w:p>
       <w:r>
         <w:t>Verified past the usual db:push (Entry 63 wrapper) + prisma generate + backfill + build/typecheck/lint/vitest (93 tests, up from 88): started the dev server and curl-fetched the real rendered homepage HTML, confirming all four section headings, the sidebar's Discord button and seal list, and numbered rank badges (1 through 8, correctly sequential) actually appear in the output — not just that the code compiled. Specifically checked a title known to have a real review score to confirm the rank badge and the existing score/CB badges coexist without visual collision in the markup. Same stated gap as every visual pass this session: actual spacing/proportions of the new two-column layout at different viewport widths needs the user's own look in a browser, which wasn't available here.</w:t>
+      </w:r>
+    </w:p>
+    <w:p/>
+    <w:p>
+      <w:pPr>
+        <w:pStyle w:val="Heading1"/>
+        <w:spacing w:before="360"/>
+      </w:pPr>
+      <w:r>
+        <w:t>Entry 78: Reviews Page Redesign — Roomier Single-Column List</w:t>
+      </w:r>
+    </w:p>
+    <w:p>
+      <w:pPr>
+        <w:spacing w:after="80"/>
+      </w:pPr>
+      <w:r>
+        <w:rPr>
+          <w:rStyle w:val="FieldLabel"/>
+        </w:rPr>
+        <w:t xml:space="preserve">Date: </w:t>
+      </w:r>
+      <w:r>
+        <w:t>2026-08-26</w:t>
+      </w:r>
+    </w:p>
+    <w:p>
+      <w:pPr>
+        <w:spacing w:after="80"/>
+      </w:pPr>
+      <w:r>
+        <w:rPr>
+          <w:rStyle w:val="FieldLabel"/>
+        </w:rPr>
+        <w:t xml:space="preserve">Type: </w:t>
+      </w:r>
+      <w:r>
+        <w:t>Decision</w:t>
+      </w:r>
+    </w:p>
+    <w:p>
+      <w:pPr>
+        <w:spacing w:after="80"/>
+      </w:pPr>
+      <w:r>
+        <w:rPr>
+          <w:rStyle w:val="FieldLabel"/>
+        </w:rPr>
+        <w:t xml:space="preserve">Status: </w:t>
+      </w:r>
+      <w:r>
+        <w:rPr>
+          <w:b/>
+          <w:color w:val="2E7D32"/>
+        </w:rPr>
+        <w:t>Resolved</w:t>
+      </w:r>
+    </w:p>
+    <w:p>
+      <w:pPr>
+        <w:spacing w:after="80"/>
+      </w:pPr>
+      <w:r>
+        <w:rPr>
+          <w:rStyle w:val="FieldLabel"/>
+        </w:rPr>
+        <w:t xml:space="preserve">Relates To: </w:t>
+      </w:r>
+      <w:r>
+        <w:t>User shared a screenshot of the live /reviews page and described it as chaotic and hard to look at — a dense 3-column grid of near-identical small cards (small cover, cramped text, low-contrast score badge), several showing the same title's cover repeated back-to-back for different reviewers.</w:t>
+      </w:r>
+    </w:p>
+    <w:p>
+      <w:pPr>
+        <w:pStyle w:val="Heading2"/>
+      </w:pPr>
+      <w:r>
+        <w:t>What this step was about</w:t>
+      </w:r>
+    </w:p>
+    <w:p>
+      <w:r>
+        <w:t>Diagnosed the actual causes rather than just applying generic polish: the page reused LatestReviews, a component built for the homepage's compact 6-item preview strip, at full 24-item browse-page scale — the density that works for a small teaser reads as noisy at review-page scale, compounded by a small thumbnail, tight 3-line excerpt clamp, and a low-contrast score chip.</w:t>
+      </w:r>
+    </w:p>
+    <w:p>
+      <w:r>
+        <w:t>New src/components/review-list.tsx is a separate component, not LatestReviews with a density flag — the homepage teaser and a dedicated browse page genuinely want different layouts (compact grid vs. roomy single-column feed), and this project has consistently preferred a new purpose-built component over overloading one with a mode switch (Entry 68's hover popover, Entry 77's HomeSidebar vs. reusing TitleCardGrid awkwardly). LatestReviews itself is untouched — the homepage strip keeps its existing look.</w:t>
+      </w:r>
+    </w:p>
+    <w:p>
+      <w:pPr>
+        <w:pStyle w:val="Heading2"/>
+      </w:pPr>
+      <w:r>
+        <w:t>Decision made</w:t>
+      </w:r>
+    </w:p>
+    <w:p>
+      <w:r>
+        <w:t>Single-column list, one review per full-width row: larger 2:3 cover (w-20/w-24 vs. the old h-24 w-16), title and score badge in a clear header row instead of stacked small text, byline gained a relative timestamp (formatRelativeTime, extending Entry 77's helper beyond its original sidebar-only scope) alongside the username, and the excerpt clamp grew from 3 to 3-4 lines with more line-height. Seal chips switched from a plain grey pill to the same accent-tinted style titles/[id]/page.tsx already uses, for consistency. Container width narrowed from max-w-5xl to the shared CONTAINER constant (max-w-3xl) — a controlled reading width suits a single-column text-heavy feed better than the wide grid's width did.</w:t>
+      </w:r>
+    </w:p>
+    <w:p>
+      <w:pPr>
+        <w:pStyle w:val="Heading2"/>
+      </w:pPr>
+      <w:r>
+        <w:t>Why this decision was made</w:t>
+      </w:r>
+    </w:p>
+    <w:p>
+      <w:r>
+        <w:t>Verified via a genuinely fresh dev server (this one surfaced a real 'stale process' scare — killing by a fresh Get-NetTCPConnection lookup transiently returned no match, leaving an old process alive that threw a real 'LatestReviews is not defined' HMR error from a half-applied hot-reload; caught it, force-killed the whole process cluster by PID, and confirmed a truly clean restart before treating the fix as verified) and curl-fetching the rendered /reviews HTML: confirmed all 17 reviews render with the new cover treatment, the accent score badge, and a relative timestamp, with zero runtime errors in the server log.</w:t>
       </w:r>
     </w:p>
     <w:p/>

</xml_diff>

<commit_message>
Journal: log Entry 79 -- seal badge corner-clip fix
Co-Authored-By: Claude Sonnet 5 <noreply@anthropic.com>
</commit_message>
<xml_diff>
--- a/Projectinformation/Development_Journal.docx
+++ b/Projectinformation/Development_Journal.docx
@@ -29,7 +29,7 @@
         <w:jc w:val="center"/>
       </w:pPr>
       <w:r>
-        <w:t>Generated 2026-08-26</w:t>
+        <w:t>Generated 2026-08-27</w:t>
       </w:r>
     </w:p>
     <w:p/>
@@ -13463,6 +13463,120 @@
     <w:p>
       <w:r>
         <w:t>Verified via a genuinely fresh dev server (this one surfaced a real 'stale process' scare — killing by a fresh Get-NetTCPConnection lookup transiently returned no match, leaving an old process alive that threw a real 'LatestReviews is not defined' HMR error from a half-applied hot-reload; caught it, force-killed the whole process cluster by PID, and confirmed a truly clean restart before treating the fix as verified) and curl-fetching the rendered /reviews HTML: confirmed all 17 reviews render with the new cover treatment, the accent score badge, and a relative timestamp, with zero runtime errors in the server log.</w:t>
+      </w:r>
+    </w:p>
+    <w:p/>
+    <w:p>
+      <w:pPr>
+        <w:pStyle w:val="Heading1"/>
+        <w:spacing w:before="360"/>
+      </w:pPr>
+      <w:r>
+        <w:t>Entry 79: Certified Banger Badge Clipped at Card Corner</w:t>
+      </w:r>
+    </w:p>
+    <w:p>
+      <w:pPr>
+        <w:spacing w:after="80"/>
+      </w:pPr>
+      <w:r>
+        <w:rPr>
+          <w:rStyle w:val="FieldLabel"/>
+        </w:rPr>
+        <w:t xml:space="preserve">Date: </w:t>
+      </w:r>
+      <w:r>
+        <w:t>2026-08-27</w:t>
+      </w:r>
+    </w:p>
+    <w:p>
+      <w:pPr>
+        <w:spacing w:after="80"/>
+      </w:pPr>
+      <w:r>
+        <w:rPr>
+          <w:rStyle w:val="FieldLabel"/>
+        </w:rPr>
+        <w:t xml:space="preserve">Type: </w:t>
+      </w:r>
+      <w:r>
+        <w:t>Bugfix</w:t>
+      </w:r>
+    </w:p>
+    <w:p>
+      <w:pPr>
+        <w:spacing w:after="80"/>
+      </w:pPr>
+      <w:r>
+        <w:rPr>
+          <w:rStyle w:val="FieldLabel"/>
+        </w:rPr>
+        <w:t xml:space="preserve">Status: </w:t>
+      </w:r>
+      <w:r>
+        <w:rPr>
+          <w:b/>
+          <w:color w:val="2E7D32"/>
+        </w:rPr>
+        <w:t>Resolved</w:t>
+      </w:r>
+    </w:p>
+    <w:p>
+      <w:pPr>
+        <w:spacing w:after="80"/>
+      </w:pPr>
+      <w:r>
+        <w:rPr>
+          <w:rStyle w:val="FieldLabel"/>
+        </w:rPr>
+        <w:t xml:space="preserve">Relates To: </w:t>
+      </w:r>
+      <w:r>
+        <w:t>Found during a real-browser QA pass over the recent redesigns (Entries 74-78), which had only ever been verified via curl/build checks, never visually confirmed in an actual browser.</w:t>
+      </w:r>
+    </w:p>
+    <w:p>
+      <w:pPr>
+        <w:pStyle w:val="Heading2"/>
+      </w:pPr>
+      <w:r>
+        <w:t>What this step was about</w:t>
+      </w:r>
+    </w:p>
+    <w:p>
+      <w:r>
+        <w:t>The gold Certified Banger seal badge (the standalone 🏅 emoji pill TitleCardGrid renders in a card cover corner) rendered visibly cut off on every card that has the seal — confirmed live on production (/, /seals) and reproduced locally.</w:t>
+      </w:r>
+    </w:p>
+    <w:p>
+      <w:r>
+        <w:t>The badge sits at title-card-grid.tsx, absolutely positioned at left-1.5 (6px) and top-1.5 or top-8 from the card cover edge, inside a wrapper with CARD (rounded-xl) + overflow-hidden for the card's own rounded corners. The pill had no fixed height — flex items-center centered content within a line-box sized purely by the text-xs/py-0.5 default line-height. The 🏅 glyph itself (medal + ribbon, confirmed by zooming the unclipped header-logo instance of the same emoji) renders taller than that line-box, so its top edge overflowed above the pill and, sitting only 6px from the card's own top edge, got clipped by the outer overflow-hidden — leaving only the gold circle plus a stray sliver of the ribbon visible.</w:t>
+      </w:r>
+    </w:p>
+    <w:p>
+      <w:pPr>
+        <w:pStyle w:val="Heading2"/>
+      </w:pPr>
+      <w:r>
+        <w:t>Decision made</w:t>
+      </w:r>
+    </w:p>
+    <w:p>
+      <w:r>
+        <w:t>Gave the badge pill a fixed height (h-5) with items-center + justify-center + leading-none so the emoji is vertically centered inside a box tall enough to contain its full glyph, instead of relying on the emoji's natural (taller-than-text) line-box. Matches the pattern the adjacent rank-number badge (h-5 w-5, added in Entry 77) already used without issue — no new pattern introduced.</w:t>
+      </w:r>
+    </w:p>
+    <w:p>
+      <w:pPr>
+        <w:pStyle w:val="Heading2"/>
+      </w:pPr>
+      <w:r>
+        <w:t>Why this decision was made</w:t>
+      </w:r>
+    </w:p>
+    <w:p>
+      <w:r>
+        <w:t>Verified visually via Claude in Chrome: reproduced the clipped badge on production (both the homepage's Certified Bangers section and /seals), confirmed the fix locally on a fresh dev server across both badge placements — the plain top-1.5 case and the rank-adjacent top-8 case (homepage "Most Follows", e.g. Attack on Titan at #3) — by zooming into screenshots of each. Also confirmed via zooming the header/footer logo's unclipped 🏅 that the visible artifact really was the emoji's own ribbon shape being cut, not a separate rendering bug. Note: this session's browser-automation window resize did not actually change the rendered viewport (screenshots stayed pinned at 1568x726 regardless of the requested size), so true mobile/responsive viewport testing was not possible this pass — WP7.2's mobile QA remains code-level-only, not device/viewport-verified in an actual narrow layout.</w:t>
       </w:r>
     </w:p>
     <w:p/>

</xml_diff>

<commit_message>
Journal: log Entry 80 -- bold/vibrant palette redesign
Co-Authored-By: Claude Sonnet 5 <noreply@anthropic.com>
</commit_message>
<xml_diff>
--- a/Projectinformation/Development_Journal.docx
+++ b/Projectinformation/Development_Journal.docx
@@ -13577,6 +13577,120 @@
     <w:p>
       <w:r>
         <w:t>Verified visually via Claude in Chrome: reproduced the clipped badge on production (both the homepage's Certified Bangers section and /seals), confirmed the fix locally on a fresh dev server across both badge placements — the plain top-1.5 case and the rank-adjacent top-8 case (homepage "Most Follows", e.g. Attack on Titan at #3) — by zooming into screenshots of each. Also confirmed via zooming the header/footer logo's unclipped 🏅 that the visible artifact really was the emoji's own ribbon shape being cut, not a separate rendering bug. Note: this session's browser-automation window resize did not actually change the rendered viewport (screenshots stayed pinned at 1568x726 regardless of the requested size), so true mobile/responsive viewport testing was not possible this pass — WP7.2's mobile QA remains code-level-only, not device/viewport-verified in an actual narrow layout.</w:t>
+      </w:r>
+    </w:p>
+    <w:p/>
+    <w:p>
+      <w:pPr>
+        <w:pStyle w:val="Heading1"/>
+        <w:spacing w:before="360"/>
+      </w:pPr>
+      <w:r>
+        <w:t>Entry 80: Bold/Vibrant Palette Redesign</w:t>
+      </w:r>
+    </w:p>
+    <w:p>
+      <w:pPr>
+        <w:spacing w:after="80"/>
+      </w:pPr>
+      <w:r>
+        <w:rPr>
+          <w:rStyle w:val="FieldLabel"/>
+        </w:rPr>
+        <w:t xml:space="preserve">Date: </w:t>
+      </w:r>
+      <w:r>
+        <w:t>2026-08-27</w:t>
+      </w:r>
+    </w:p>
+    <w:p>
+      <w:pPr>
+        <w:spacing w:after="80"/>
+      </w:pPr>
+      <w:r>
+        <w:rPr>
+          <w:rStyle w:val="FieldLabel"/>
+        </w:rPr>
+        <w:t xml:space="preserve">Type: </w:t>
+      </w:r>
+      <w:r>
+        <w:t>Decision</w:t>
+      </w:r>
+    </w:p>
+    <w:p>
+      <w:pPr>
+        <w:spacing w:after="80"/>
+      </w:pPr>
+      <w:r>
+        <w:rPr>
+          <w:rStyle w:val="FieldLabel"/>
+        </w:rPr>
+        <w:t xml:space="preserve">Status: </w:t>
+      </w:r>
+      <w:r>
+        <w:rPr>
+          <w:b/>
+          <w:color w:val="2E7D32"/>
+        </w:rPr>
+        <w:t>Resolved</w:t>
+      </w:r>
+    </w:p>
+    <w:p>
+      <w:pPr>
+        <w:spacing w:after="80"/>
+      </w:pPr>
+      <w:r>
+        <w:rPr>
+          <w:rStyle w:val="FieldLabel"/>
+        </w:rPr>
+        <w:t xml:space="preserve">Relates To: </w:t>
+      </w:r>
+      <w:r>
+        <w:t>User-reported: the dark-first AniList-inspired redesign from Entry 76-ish (2026-08-19) still read as "plain and boring" — asked for a massive visual improvement. Clarified via direct questions: the specific complaint was flat/muted colors (a single warm amber accent funneled through everything on a flat dark background), and the requested direction was bold &amp; vibrant, not a full structural/layout redesign.</w:t>
+      </w:r>
+    </w:p>
+    <w:p>
+      <w:pPr>
+        <w:pStyle w:val="Heading2"/>
+      </w:pPr>
+      <w:r>
+        <w:t>What this step was about</w:t>
+      </w:r>
+    </w:p>
+    <w:p>
+      <w:r>
+        <w:t>Added a second brand accent (a hot-pink/magenta) alongside a punchier, more saturated orange, boosted the semantic success/warning/danger tokens, added a subtle sitewide atmospheric gradient mesh, and gave several previously-flat UI elements (review score badges, seal-type chips, hero wordmark/CTA/icons) real color variety instead of every element reaching for the same single accent.</w:t>
+      </w:r>
+    </w:p>
+    <w:p>
+      <w:r>
+        <w:t>The token layer (globals.css + ui-classes.ts, Entry 66's shared-primitive convention) meant most of the win could be had by editing a small number of files rather than touching every page — anything already built on BUTTON_PRIMARY/CARD_HOVER/scoreColor picked up the richer palette automatically. Two real, unrelated things were found and fixed along the way: (1) the homepage's own top-level wrapper div re-asserted an opaque bg-background class, which silently defeated the new body-level mesh background for the entire page below the hero — removed since it was a redundant duplicate of the color body already paints, not a deliberate choice (checked: only two files in the app do this, the other being admin/layout.tsx, deliberately left alone since the admin panel is utility chrome, not a marketing surface). (2) review-list.tsx, latest-reviews.tsx, and titles/[id]/page.tsx all rendered every review's overall score as the same flat accent-colored pill regardless of whether it was a 2.5 or a 5.0 — a concrete instance of the exact complaint driving this session.</w:t>
+      </w:r>
+    </w:p>
+    <w:p>
+      <w:pPr>
+        <w:pStyle w:val="Heading2"/>
+      </w:pPr>
+      <w:r>
+        <w:t>Decision made</w:t>
+      </w:r>
+    </w:p>
+    <w:p>
+      <w:r>
+        <w:t>New --accent-2 token (hot pink/magenta, #ff3d9a dark / #d6207a light) reserved for marketing/brand moments (hero wordmark gradient text, hero glow blobs, BUTTON_HERO, the Certified Bangers spotlight panel, seal-badge ring) rather than blended into every button — kept BUTTON_PRIMARY single-hue so the admin panel and ordinary form actions don't turn into a rainbow. --accent itself pushed from a dull #e2a33d to a more saturated #ff8a3d, and success/warning/danger tokens similarly brightened. A new reviewScoreColor() (score-color.ts) tiers review-score badges into emerald/amber/rose bands exactly like the existing AniList-score scoreColor(), wired into all three places that render a review's overall score. Hidden Gem seal chips standardized on sky-blue (previously inconsistent — emerald in one file, unset in others) to stay visually distinct from the emerald/amber/rose score tiers. Homepage "how it works" icons alternate accent/accent-2 tinted circle chips instead of three identical flat icons.</w:t>
+      </w:r>
+    </w:p>
+    <w:p>
+      <w:pPr>
+        <w:pStyle w:val="Heading2"/>
+      </w:pPr>
+      <w:r>
+        <w:t>Why this decision was made</w:t>
+      </w:r>
+    </w:p>
+    <w:p>
+      <w:r>
+        <w:t>Verified visually via Claude in Chrome against a fresh local dev server across the homepage, /titles, /reviews, /seals, a title detail page, a profile page, and /login — confirmed the gradient wordmark, richer hero glow, tiered score badges, and sitewide mesh all render as intended and nothing regressed contrast-wise (the new accent is brighter/higher-luminance than the old one, not dimmer). Confirmed the mesh-background fix specifically by screenshotting the homepage before and after removing the redundant bg-background wrapper. npm run build, lint, and tsc --noEmit all clean (one build attempt hit an unrelated transient Windows Turbopack worker crash; a retry succeeded cleanly). Not yet re-verified on the actual mobile/narrow viewport (same resize_window limitation as Entry 79) or spot-checked across the full ~20-file admin panel beyond confirming it still builds — those inherit the new tokens automatically via the shared primitives but weren't individually screenshotted this pass.</w:t>
       </w:r>
     </w:p>
     <w:p/>

</xml_diff>